<commit_message>
End-to-end connectivity for Places page
</commit_message>
<xml_diff>
--- a/docs/730087020 ECM3432DA Software Engineering 1 Agile Development Exercise.docx
+++ b/docs/730087020 ECM3432DA Software Engineering 1 Agile Development Exercise.docx
@@ -1708,11 +1708,11 @@
         <w:fldChar w:fldCharType="end"/>
       </w:r>
     </w:p>
-    <w:bookmarkStart w:id="1" w:name="_Toc220332530"/>
     <w:p>
       <w:pPr>
         <w:pStyle w:val="Heading1"/>
       </w:pPr>
+      <w:bookmarkStart w:id="1" w:name="_Toc220332530"/>
       <w:r>
         <w:rPr>
           <w:noProof/>
@@ -2101,11 +2101,11 @@
                               <w:pStyle w:val="Heading2"/>
                               <w:spacing w:line="276" w:lineRule="auto"/>
                             </w:pPr>
-                            <w:bookmarkStart w:id="3" w:name="_Toc220332532"/>
+                            <w:bookmarkStart w:id="4" w:name="_Toc220332532"/>
                             <w:r>
                               <w:t>1.2. Objectives</w:t>
                             </w:r>
-                            <w:bookmarkEnd w:id="3"/>
+                            <w:bookmarkEnd w:id="4"/>
                           </w:p>
                           <w:p>
                             <w:pPr>
@@ -2357,32 +2357,32 @@
       <w:pPr>
         <w:pStyle w:val="Heading1"/>
       </w:pPr>
-      <w:bookmarkStart w:id="4" w:name="_Toc220332533"/>
+      <w:bookmarkStart w:id="6" w:name="_Toc220332533"/>
       <w:r>
         <w:lastRenderedPageBreak/>
         <w:t>2. Artifacts</w:t>
       </w:r>
-      <w:bookmarkEnd w:id="4"/>
+      <w:bookmarkEnd w:id="6"/>
     </w:p>
     <w:p>
       <w:pPr>
         <w:pStyle w:val="Heading2"/>
       </w:pPr>
-      <w:bookmarkStart w:id="5" w:name="_Toc220332534"/>
+      <w:bookmarkStart w:id="7" w:name="_Toc220332534"/>
       <w:r>
         <w:t>2.1. Statement of Requirements</w:t>
       </w:r>
-      <w:bookmarkEnd w:id="5"/>
+      <w:bookmarkEnd w:id="7"/>
     </w:p>
     <w:p>
       <w:pPr>
         <w:pStyle w:val="Heading3"/>
       </w:pPr>
-      <w:bookmarkStart w:id="6" w:name="_Toc220332535"/>
+      <w:bookmarkStart w:id="8" w:name="_Toc220332535"/>
       <w:r>
         <w:t>Functional</w:t>
       </w:r>
-      <w:bookmarkEnd w:id="6"/>
+      <w:bookmarkEnd w:id="8"/>
     </w:p>
     <w:tbl>
       <w:tblPr>
@@ -3169,12 +3169,12 @@
       <w:pPr>
         <w:pStyle w:val="Heading3"/>
       </w:pPr>
-      <w:bookmarkStart w:id="7" w:name="_Toc220332536"/>
+      <w:bookmarkStart w:id="9" w:name="_Toc220332536"/>
       <w:r>
         <w:lastRenderedPageBreak/>
         <w:t>Non-Functional</w:t>
       </w:r>
-      <w:bookmarkEnd w:id="7"/>
+      <w:bookmarkEnd w:id="9"/>
     </w:p>
     <w:tbl>
       <w:tblPr>
@@ -3658,33 +3658,13 @@
       <w:pPr>
         <w:pStyle w:val="Heading2"/>
       </w:pPr>
-      <w:bookmarkStart w:id="8" w:name="_Toc220332537"/>
+      <w:bookmarkStart w:id="10" w:name="_Toc220332537"/>
       <w:r>
         <w:lastRenderedPageBreak/>
         <w:t>2</w:t>
       </w:r>
       <w:r>
         <w:t>.2. Software Architecture</w:t>
-      </w:r>
-      <w:bookmarkEnd w:id="8"/>
-    </w:p>
-    <w:p>
-      <w:pPr>
-        <w:pStyle w:val="Heading3"/>
-      </w:pPr>
-      <w:bookmarkStart w:id="9" w:name="_Toc220332538"/>
-      <w:r>
-        <w:t>Client-Server Pattern</w:t>
-      </w:r>
-      <w:bookmarkEnd w:id="9"/>
-    </w:p>
-    <w:p>
-      <w:pPr>
-        <w:pStyle w:val="Heading3"/>
-      </w:pPr>
-      <w:bookmarkStart w:id="10" w:name="_Toc220332539"/>
-      <w:r>
-        <w:t>Server Architecture Design</w:t>
       </w:r>
       <w:bookmarkEnd w:id="10"/>
     </w:p>
@@ -3692,11 +3672,31 @@
       <w:pPr>
         <w:pStyle w:val="Heading3"/>
       </w:pPr>
-      <w:bookmarkStart w:id="11" w:name="_Toc220332540"/>
+      <w:bookmarkStart w:id="11" w:name="_Toc220332538"/>
+      <w:r>
+        <w:t>Client-Server Pattern</w:t>
+      </w:r>
+      <w:bookmarkEnd w:id="11"/>
+    </w:p>
+    <w:p>
+      <w:pPr>
+        <w:pStyle w:val="Heading3"/>
+      </w:pPr>
+      <w:bookmarkStart w:id="12" w:name="_Toc220332539"/>
+      <w:r>
+        <w:t>Server Architecture Design</w:t>
+      </w:r>
+      <w:bookmarkEnd w:id="12"/>
+    </w:p>
+    <w:p>
+      <w:pPr>
+        <w:pStyle w:val="Heading3"/>
+      </w:pPr>
+      <w:bookmarkStart w:id="13" w:name="_Toc220332540"/>
       <w:r>
         <w:t>Client Architecture Design</w:t>
       </w:r>
-      <w:bookmarkEnd w:id="11"/>
+      <w:bookmarkEnd w:id="13"/>
     </w:p>
     <w:p/>
     <w:p>
@@ -3716,7 +3716,7 @@
       <w:pPr>
         <w:pStyle w:val="Heading2"/>
       </w:pPr>
-      <w:bookmarkStart w:id="12" w:name="_Toc220332541"/>
+      <w:bookmarkStart w:id="14" w:name="_Toc220332541"/>
       <w:r>
         <w:lastRenderedPageBreak/>
         <w:t>2</w:t>
@@ -3724,7 +3724,7 @@
       <w:r>
         <w:t>.3. Client UI Design</w:t>
       </w:r>
-      <w:bookmarkEnd w:id="12"/>
+      <w:bookmarkEnd w:id="14"/>
     </w:p>
     <w:p/>
     <w:p>
@@ -3744,7 +3744,7 @@
       <w:pPr>
         <w:pStyle w:val="Heading2"/>
       </w:pPr>
-      <w:bookmarkStart w:id="13" w:name="_Toc220332542"/>
+      <w:bookmarkStart w:id="15" w:name="_Toc220332542"/>
       <w:r>
         <w:lastRenderedPageBreak/>
         <w:t>2</w:t>
@@ -3752,7 +3752,7 @@
       <w:r>
         <w:t>.4. Software Release</w:t>
       </w:r>
-      <w:bookmarkEnd w:id="13"/>
+      <w:bookmarkEnd w:id="15"/>
     </w:p>
     <w:p/>
     <w:p>
@@ -3760,218 +3760,7 @@
         <w:br w:type="page"/>
       </w:r>
     </w:p>
-    <w:p>
-      <w:r>
-        <w:lastRenderedPageBreak/>
-        <w:t>Timeline:</w:t>
-      </w:r>
-    </w:p>
-    <w:p>
-      <w:pPr>
-        <w:pStyle w:val="ListParagraph"/>
-        <w:numPr>
-          <w:ilvl w:val="0"/>
-          <w:numId w:val="20"/>
-        </w:numPr>
-      </w:pPr>
-      <w:r>
-        <w:t>Requirements Engineering</w:t>
-      </w:r>
-    </w:p>
-    <w:p>
-      <w:pPr>
-        <w:pStyle w:val="ListParagraph"/>
-        <w:numPr>
-          <w:ilvl w:val="1"/>
-          <w:numId w:val="20"/>
-        </w:numPr>
-      </w:pPr>
-      <w:r>
-        <w:t>Personas</w:t>
-      </w:r>
-    </w:p>
-    <w:p>
-      <w:pPr>
-        <w:pStyle w:val="ListParagraph"/>
-        <w:numPr>
-          <w:ilvl w:val="1"/>
-          <w:numId w:val="20"/>
-        </w:numPr>
-      </w:pPr>
-      <w:r>
-        <w:t>Epics</w:t>
-      </w:r>
-    </w:p>
-    <w:p>
-      <w:pPr>
-        <w:pStyle w:val="ListParagraph"/>
-        <w:numPr>
-          <w:ilvl w:val="1"/>
-          <w:numId w:val="20"/>
-        </w:numPr>
-      </w:pPr>
-      <w:r>
-        <w:t>User stories</w:t>
-      </w:r>
-    </w:p>
-    <w:p>
-      <w:pPr>
-        <w:pStyle w:val="ListParagraph"/>
-        <w:numPr>
-          <w:ilvl w:val="1"/>
-          <w:numId w:val="20"/>
-        </w:numPr>
-      </w:pPr>
-      <w:r>
-        <w:t>Non-functional</w:t>
-      </w:r>
-    </w:p>
-    <w:p>
-      <w:pPr>
-        <w:pStyle w:val="ListParagraph"/>
-        <w:numPr>
-          <w:ilvl w:val="0"/>
-          <w:numId w:val="20"/>
-        </w:numPr>
-      </w:pPr>
-      <w:r>
-        <w:t>Review of Software Assets</w:t>
-      </w:r>
-    </w:p>
-    <w:p>
-      <w:pPr>
-        <w:pStyle w:val="ListParagraph"/>
-        <w:numPr>
-          <w:ilvl w:val="0"/>
-          <w:numId w:val="20"/>
-        </w:numPr>
-      </w:pPr>
-      <w:r>
-        <w:t>Software Architecture Design</w:t>
-      </w:r>
-    </w:p>
-    <w:p>
-      <w:pPr>
-        <w:pStyle w:val="ListParagraph"/>
-        <w:numPr>
-          <w:ilvl w:val="1"/>
-          <w:numId w:val="20"/>
-        </w:numPr>
-      </w:pPr>
-      <w:r>
-        <w:t>Client-Server</w:t>
-      </w:r>
-    </w:p>
-    <w:p>
-      <w:pPr>
-        <w:pStyle w:val="ListParagraph"/>
-        <w:numPr>
-          <w:ilvl w:val="0"/>
-          <w:numId w:val="20"/>
-        </w:numPr>
-      </w:pPr>
-      <w:r>
-        <w:t>Client UI Design</w:t>
-      </w:r>
-    </w:p>
-    <w:p>
-      <w:pPr>
-        <w:pStyle w:val="ListParagraph"/>
-        <w:numPr>
-          <w:ilvl w:val="0"/>
-          <w:numId w:val="20"/>
-        </w:numPr>
-      </w:pPr>
-      <w:r>
-        <w:t>Development &amp; Testing</w:t>
-      </w:r>
-    </w:p>
-    <w:p>
-      <w:pPr>
-        <w:pStyle w:val="ListParagraph"/>
-        <w:numPr>
-          <w:ilvl w:val="1"/>
-          <w:numId w:val="20"/>
-        </w:numPr>
-      </w:pPr>
-      <w:r>
-        <w:t>Initial backlog &amp; Sprint 1 planning – kanban update</w:t>
-      </w:r>
-    </w:p>
-    <w:p>
-      <w:pPr>
-        <w:pStyle w:val="ListParagraph"/>
-        <w:numPr>
-          <w:ilvl w:val="1"/>
-          <w:numId w:val="20"/>
-        </w:numPr>
-      </w:pPr>
-      <w:r>
-        <w:t>Sprint 1 dev &amp; testing, Sprint 1 retro, Sprint 2 planning – kanban update</w:t>
-      </w:r>
-    </w:p>
-    <w:p>
-      <w:pPr>
-        <w:pStyle w:val="ListParagraph"/>
-        <w:numPr>
-          <w:ilvl w:val="1"/>
-          <w:numId w:val="20"/>
-        </w:numPr>
-      </w:pPr>
-      <w:r>
-        <w:t>Sprint 2 dev and testing, Sprint 2 retro, Sprint 3 planning – kanban update</w:t>
-      </w:r>
-    </w:p>
-    <w:p>
-      <w:pPr>
-        <w:pStyle w:val="ListParagraph"/>
-        <w:numPr>
-          <w:ilvl w:val="1"/>
-          <w:numId w:val="20"/>
-        </w:numPr>
-      </w:pPr>
-      <w:r>
-        <w:t>Sprint 3 dev and testing, Sprint 3 retro, Sprint 3 planning – kanban update</w:t>
-      </w:r>
-    </w:p>
-    <w:p>
-      <w:pPr>
-        <w:pStyle w:val="ListParagraph"/>
-        <w:numPr>
-          <w:ilvl w:val="1"/>
-          <w:numId w:val="20"/>
-        </w:numPr>
-      </w:pPr>
-      <w:r>
-        <w:t>Sprint 4 dev and testing, Sprint 4 retro – kanban update</w:t>
-      </w:r>
-    </w:p>
-    <w:p>
-      <w:pPr>
-        <w:pStyle w:val="ListParagraph"/>
-        <w:numPr>
-          <w:ilvl w:val="0"/>
-          <w:numId w:val="20"/>
-        </w:numPr>
-      </w:pPr>
-      <w:r>
-        <w:t>Demo</w:t>
-      </w:r>
-    </w:p>
-    <w:p>
-      <w:pPr>
-        <w:rPr>
-          <w:rFonts w:asciiTheme="majorHAnsi" w:eastAsiaTheme="majorEastAsia" w:hAnsiTheme="majorHAnsi" w:cstheme="majorBidi"/>
-          <w:color w:val="0F4761" w:themeColor="accent1" w:themeShade="BF"/>
-          <w:sz w:val="40"/>
-          <w:szCs w:val="40"/>
-        </w:rPr>
-      </w:pPr>
-      <w:r>
-        <w:br w:type="page"/>
-      </w:r>
-    </w:p>
-    <w:bookmarkStart w:id="14" w:name="_Toc220332543"/>
+    <w:bookmarkStart w:id="16" w:name="_Toc220332543"/>
     <w:p>
       <w:pPr>
         <w:pStyle w:val="Heading1"/>
@@ -4071,9 +3860,9 @@
       <w:r>
         <w:t>. Process</w:t>
       </w:r>
-      <w:bookmarkEnd w:id="14"/>
+      <w:bookmarkEnd w:id="16"/>
     </w:p>
-    <w:bookmarkStart w:id="15" w:name="_Toc220332544"/>
+    <w:bookmarkStart w:id="17" w:name="_Toc220332544"/>
     <w:p>
       <w:pPr>
         <w:pStyle w:val="Heading2"/>
@@ -4341,7 +4130,7 @@
       <w:r>
         <w:t>Requirements Engineering</w:t>
       </w:r>
-      <w:bookmarkEnd w:id="15"/>
+      <w:bookmarkEnd w:id="17"/>
     </w:p>
     <w:p>
       <w:r>
@@ -5825,7 +5614,7 @@
           <w:noProof/>
         </w:rPr>
         <w:drawing>
-          <wp:anchor distT="0" distB="0" distL="114300" distR="114300" simplePos="0" relativeHeight="251658257" behindDoc="0" locked="0" layoutInCell="1" allowOverlap="1" wp14:anchorId="68A71638" wp14:editId="70D8F961">
+          <wp:anchor distT="0" distB="0" distL="114300" distR="114300" simplePos="0" relativeHeight="251658257" behindDoc="0" locked="0" layoutInCell="1" allowOverlap="1" wp14:anchorId="68A71638" wp14:editId="4507EA61">
             <wp:simplePos x="0" y="0"/>
             <wp:positionH relativeFrom="column">
               <wp:posOffset>6290310</wp:posOffset>
@@ -6189,7 +5978,7 @@
         </mc:AlternateContent>
       </w:r>
     </w:p>
-    <w:bookmarkStart w:id="16" w:name="_Toc220332545"/>
+    <w:bookmarkStart w:id="18" w:name="_Toc220332545"/>
     <w:p>
       <w:pPr>
         <w:pStyle w:val="Heading2"/>
@@ -6384,7 +6173,7 @@
       <w:r>
         <w:t>Software Assets</w:t>
       </w:r>
-      <w:bookmarkEnd w:id="16"/>
+      <w:bookmarkEnd w:id="18"/>
     </w:p>
     <w:p>
       <w:r>
@@ -7684,6 +7473,78 @@
                                 <w:numId w:val="41"/>
                               </w:numPr>
                             </w:pPr>
+                            <w:r>
+                              <w:t xml:space="preserve">Layered server architecture </w:t>
+                            </w:r>
+                            <w:r>
+                              <w:t xml:space="preserve">allows a basic solution </w:t>
+                            </w:r>
+                            <w:r>
+                              <w:t xml:space="preserve">on a layer </w:t>
+                            </w:r>
+                            <w:r>
+                              <w:t>for the MVP, like SQLite</w:t>
+                            </w:r>
+                            <w:r>
+                              <w:t xml:space="preserve"> </w:t>
+                            </w:r>
+                            <w:r>
+                              <w:t>or the</w:t>
+                            </w:r>
+                            <w:r>
+                              <w:t xml:space="preserve"> limited API</w:t>
+                            </w:r>
+                            <w:r>
+                              <w:t xml:space="preserve">, </w:t>
+                            </w:r>
+                            <w:r>
+                              <w:t>to be swapped for a more robust solution with little refactoring</w:t>
+                            </w:r>
+                            <w:r>
+                              <w:t xml:space="preserve"> in the other layers</w:t>
+                            </w:r>
+                          </w:p>
+                          <w:p>
+                            <w:pPr>
+                              <w:pStyle w:val="ListParagraph"/>
+                              <w:numPr>
+                                <w:ilvl w:val="0"/>
+                                <w:numId w:val="41"/>
+                              </w:numPr>
+                            </w:pPr>
+                            <w:r>
+                              <w:t>Client-server allows for place data to be served from a ‘single source of truth’ database without duplication.</w:t>
+                            </w:r>
+                            <w:r>
+                              <w:t xml:space="preserve"> It also ensure</w:t>
+                            </w:r>
+                            <w:r>
+                              <w:t>s</w:t>
+                            </w:r>
+                            <w:r>
+                              <w:t xml:space="preserve"> data security by acting as a middleman checking account permissions</w:t>
+                            </w:r>
+                          </w:p>
+                          <w:p>
+                            <w:pPr>
+                              <w:pStyle w:val="ListParagraph"/>
+                              <w:numPr>
+                                <w:ilvl w:val="0"/>
+                                <w:numId w:val="41"/>
+                              </w:numPr>
+                            </w:pPr>
+                            <w:r>
+                              <w:t xml:space="preserve">Client-server allows for easy scaling of </w:t>
+                            </w:r>
+                            <w:r>
+                              <w:t xml:space="preserve">both </w:t>
+                            </w:r>
+                            <w:r>
+                              <w:t xml:space="preserve">users and </w:t>
+                            </w:r>
+                            <w:r>
+                              <w:t>backend resources independently</w:t>
+                            </w:r>
                           </w:p>
                         </w:txbxContent>
                       </wps:txbx>
@@ -7723,6 +7584,78 @@
                           <w:numId w:val="41"/>
                         </w:numPr>
                       </w:pPr>
+                      <w:r>
+                        <w:t xml:space="preserve">Layered server architecture </w:t>
+                      </w:r>
+                      <w:r>
+                        <w:t xml:space="preserve">allows a basic solution </w:t>
+                      </w:r>
+                      <w:r>
+                        <w:t xml:space="preserve">on a layer </w:t>
+                      </w:r>
+                      <w:r>
+                        <w:t>for the MVP, like SQLite</w:t>
+                      </w:r>
+                      <w:r>
+                        <w:t xml:space="preserve"> </w:t>
+                      </w:r>
+                      <w:r>
+                        <w:t>or the</w:t>
+                      </w:r>
+                      <w:r>
+                        <w:t xml:space="preserve"> limited API</w:t>
+                      </w:r>
+                      <w:r>
+                        <w:t xml:space="preserve">, </w:t>
+                      </w:r>
+                      <w:r>
+                        <w:t>to be swapped for a more robust solution with little refactoring</w:t>
+                      </w:r>
+                      <w:r>
+                        <w:t xml:space="preserve"> in the other layers</w:t>
+                      </w:r>
+                    </w:p>
+                    <w:p>
+                      <w:pPr>
+                        <w:pStyle w:val="ListParagraph"/>
+                        <w:numPr>
+                          <w:ilvl w:val="0"/>
+                          <w:numId w:val="41"/>
+                        </w:numPr>
+                      </w:pPr>
+                      <w:r>
+                        <w:t>Client-server allows for place data to be served from a ‘single source of truth’ database without duplication.</w:t>
+                      </w:r>
+                      <w:r>
+                        <w:t xml:space="preserve"> It also ensure</w:t>
+                      </w:r>
+                      <w:r>
+                        <w:t>s</w:t>
+                      </w:r>
+                      <w:r>
+                        <w:t xml:space="preserve"> data security by acting as a middleman checking account permissions</w:t>
+                      </w:r>
+                    </w:p>
+                    <w:p>
+                      <w:pPr>
+                        <w:pStyle w:val="ListParagraph"/>
+                        <w:numPr>
+                          <w:ilvl w:val="0"/>
+                          <w:numId w:val="41"/>
+                        </w:numPr>
+                      </w:pPr>
+                      <w:r>
+                        <w:t xml:space="preserve">Client-server allows for easy scaling of </w:t>
+                      </w:r>
+                      <w:r>
+                        <w:t xml:space="preserve">both </w:t>
+                      </w:r>
+                      <w:r>
+                        <w:t xml:space="preserve">users and </w:t>
+                      </w:r>
+                      <w:r>
+                        <w:t>backend resources independently</w:t>
+                      </w:r>
                     </w:p>
                   </w:txbxContent>
                 </v:textbox>
@@ -8106,7 +8039,7 @@
           <w:noProof/>
         </w:rPr>
         <w:drawing>
-          <wp:anchor distT="0" distB="0" distL="114300" distR="114300" simplePos="0" relativeHeight="251658271" behindDoc="0" locked="0" layoutInCell="1" allowOverlap="1" wp14:anchorId="23C35C18" wp14:editId="0E79C721">
+          <wp:anchor distT="0" distB="0" distL="114300" distR="114300" simplePos="0" relativeHeight="251658271" behindDoc="0" locked="0" layoutInCell="1" allowOverlap="1" wp14:anchorId="23C35C18" wp14:editId="16FEB8E5">
             <wp:simplePos x="0" y="0"/>
             <wp:positionH relativeFrom="column">
               <wp:posOffset>1829697</wp:posOffset>
@@ -8677,7 +8610,7 @@
           <w:noProof/>
         </w:rPr>
         <w:drawing>
-          <wp:anchor distT="0" distB="0" distL="114300" distR="114300" simplePos="0" relativeHeight="251658274" behindDoc="0" locked="0" layoutInCell="1" allowOverlap="1" wp14:anchorId="1C8242DE" wp14:editId="099AB0B5">
+          <wp:anchor distT="0" distB="0" distL="114300" distR="114300" simplePos="0" relativeHeight="251658274" behindDoc="0" locked="0" layoutInCell="1" allowOverlap="1" wp14:anchorId="1C8242DE" wp14:editId="494C8107">
             <wp:simplePos x="0" y="0"/>
             <wp:positionH relativeFrom="column">
               <wp:posOffset>4455160</wp:posOffset>
@@ -8745,7 +8678,7 @@
         <mc:AlternateContent>
           <mc:Choice Requires="wps">
             <w:drawing>
-              <wp:anchor distT="0" distB="0" distL="114300" distR="114300" simplePos="0" relativeHeight="251658282" behindDoc="0" locked="0" layoutInCell="1" allowOverlap="1" wp14:anchorId="4835DB23" wp14:editId="0EE5F42C">
+              <wp:anchor distT="0" distB="0" distL="114300" distR="114300" simplePos="0" relativeHeight="251658282" behindDoc="0" locked="0" layoutInCell="1" allowOverlap="1" wp14:anchorId="4835DB23" wp14:editId="0A7AC772">
                 <wp:simplePos x="0" y="0"/>
                 <wp:positionH relativeFrom="column">
                   <wp:posOffset>-3175</wp:posOffset>
@@ -8926,7 +8859,7 @@
           <w:noProof/>
         </w:rPr>
         <w:drawing>
-          <wp:anchor distT="0" distB="0" distL="114300" distR="114300" simplePos="0" relativeHeight="251658283" behindDoc="0" locked="0" layoutInCell="1" allowOverlap="1" wp14:anchorId="440DFF63" wp14:editId="6006AC53">
+          <wp:anchor distT="0" distB="0" distL="114300" distR="114300" simplePos="0" relativeHeight="251658283" behindDoc="0" locked="0" layoutInCell="1" allowOverlap="1" wp14:anchorId="440DFF63" wp14:editId="726E9B9E">
             <wp:simplePos x="0" y="0"/>
             <wp:positionH relativeFrom="column">
               <wp:posOffset>5949315</wp:posOffset>
@@ -9224,7 +9157,6 @@
         <w:t xml:space="preserve"> &amp; Places page</w:t>
       </w:r>
     </w:p>
-    <w:p/>
     <w:p>
       <w:r>
         <w:rPr>
@@ -9233,7 +9165,113 @@
         <mc:AlternateContent>
           <mc:Choice Requires="wps">
             <w:drawing>
-              <wp:anchor distT="0" distB="0" distL="114300" distR="114300" simplePos="0" relativeHeight="251658290" behindDoc="0" locked="0" layoutInCell="1" allowOverlap="1" wp14:anchorId="3BF9581D" wp14:editId="248F7913">
+              <wp:anchor distT="0" distB="0" distL="114300" distR="114300" simplePos="0" relativeHeight="251691059" behindDoc="0" locked="0" layoutInCell="1" allowOverlap="1" wp14:anchorId="257A863B" wp14:editId="45D48E40">
+                <wp:simplePos x="0" y="0"/>
+                <wp:positionH relativeFrom="column">
+                  <wp:posOffset>8251190</wp:posOffset>
+                </wp:positionH>
+                <wp:positionV relativeFrom="page">
+                  <wp:posOffset>1464764</wp:posOffset>
+                </wp:positionV>
+                <wp:extent cx="1114697" cy="228600"/>
+                <wp:effectExtent l="12700" t="152400" r="15875" b="152400"/>
+                <wp:wrapNone/>
+                <wp:docPr id="137426178" name="Text Box 5"/>
+                <wp:cNvGraphicFramePr/>
+                <a:graphic xmlns:a="http://schemas.openxmlformats.org/drawingml/2006/main">
+                  <a:graphicData uri="http://schemas.microsoft.com/office/word/2010/wordprocessingShape">
+                    <wps:wsp>
+                      <wps:cNvSpPr txBox="1"/>
+                      <wps:spPr>
+                        <a:xfrm rot="953682">
+                          <a:off x="0" y="0"/>
+                          <a:ext cx="1114697" cy="228600"/>
+                        </a:xfrm>
+                        <a:prstGeom prst="rect">
+                          <a:avLst/>
+                        </a:prstGeom>
+                        <a:noFill/>
+                        <a:ln w="6350">
+                          <a:noFill/>
+                        </a:ln>
+                      </wps:spPr>
+                      <wps:txbx>
+                        <w:txbxContent>
+                          <w:p>
+                            <w:pPr>
+                              <w:jc w:val="right"/>
+                              <w:rPr>
+                                <w:sz w:val="32"/>
+                                <w:szCs w:val="32"/>
+                              </w:rPr>
+                            </w:pPr>
+                            <w:r>
+                              <w:rPr>
+                                <w:sz w:val="32"/>
+                                <w:szCs w:val="32"/>
+                              </w:rPr>
+                              <w:t>(DIAGRAM)</w:t>
+                            </w:r>
+                          </w:p>
+                        </w:txbxContent>
+                      </wps:txbx>
+                      <wps:bodyPr rot="0" spcFirstLastPara="0" vertOverflow="overflow" horzOverflow="overflow" vert="horz" wrap="square" lIns="0" tIns="0" rIns="0" bIns="0" numCol="1" spcCol="0" rtlCol="0" fromWordArt="0" anchor="ctr" anchorCtr="0" forceAA="0" compatLnSpc="1">
+                        <a:prstTxWarp prst="textNoShape">
+                          <a:avLst/>
+                        </a:prstTxWarp>
+                        <a:noAutofit/>
+                      </wps:bodyPr>
+                    </wps:wsp>
+                  </a:graphicData>
+                </a:graphic>
+                <wp14:sizeRelH relativeFrom="margin">
+                  <wp14:pctWidth>0</wp14:pctWidth>
+                </wp14:sizeRelH>
+                <wp14:sizeRelV relativeFrom="margin">
+                  <wp14:pctHeight>0</wp14:pctHeight>
+                </wp14:sizeRelV>
+              </wp:anchor>
+            </w:drawing>
+          </mc:Choice>
+          <mc:Fallback>
+            <w:pict>
+              <v:shape w14:anchorId="257A863B" id="_x0000_s1039" type="#_x0000_t202" style="position:absolute;margin-left:649.7pt;margin-top:115.35pt;width:87.75pt;height:18pt;rotation:1041675fd;z-index:251691059;visibility:visible;mso-wrap-style:square;mso-width-percent:0;mso-height-percent:0;mso-wrap-distance-left:9pt;mso-wrap-distance-top:0;mso-wrap-distance-right:9pt;mso-wrap-distance-bottom:0;mso-position-horizontal:absolute;mso-position-horizontal-relative:text;mso-position-vertical:absolute;mso-position-vertical-relative:page;mso-width-percent:0;mso-height-percent:0;mso-width-relative:margin;mso-height-relative:margin;v-text-anchor:middle" o:gfxdata="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" filled="f" stroked="f" strokeweight=".5pt">
+                <v:textbox inset="0,0,0,0">
+                  <w:txbxContent>
+                    <w:p>
+                      <w:pPr>
+                        <w:jc w:val="right"/>
+                        <w:rPr>
+                          <w:sz w:val="32"/>
+                          <w:szCs w:val="32"/>
+                        </w:rPr>
+                      </w:pPr>
+                      <w:r>
+                        <w:rPr>
+                          <w:sz w:val="32"/>
+                          <w:szCs w:val="32"/>
+                        </w:rPr>
+                        <w:t>(DIAGRAM)</w:t>
+                      </w:r>
+                    </w:p>
+                  </w:txbxContent>
+                </v:textbox>
+                <w10:wrap anchory="page"/>
+              </v:shape>
+            </w:pict>
+          </mc:Fallback>
+        </mc:AlternateContent>
+      </w:r>
+    </w:p>
+    <w:p>
+      <w:r>
+        <w:rPr>
+          <w:noProof/>
+        </w:rPr>
+        <mc:AlternateContent>
+          <mc:Choice Requires="wps">
+            <w:drawing>
+              <wp:anchor distT="0" distB="0" distL="114300" distR="114300" simplePos="0" relativeHeight="251658290" behindDoc="0" locked="0" layoutInCell="1" allowOverlap="1" wp14:anchorId="3BF9581D" wp14:editId="5AE8171F">
                 <wp:simplePos x="0" y="0"/>
                 <wp:positionH relativeFrom="column">
                   <wp:posOffset>6002495</wp:posOffset>
@@ -9329,7 +9367,7 @@
           </mc:Choice>
           <mc:Fallback>
             <w:pict>
-              <v:roundrect w14:anchorId="3BF9581D" id="Rounded Rectangle 40" o:spid="_x0000_s1039" style="position:absolute;margin-left:472.65pt;margin-top:254.2pt;width:18.4pt;height:18.8pt;z-index:251658290;visibility:visible;mso-wrap-style:square;mso-width-percent:0;mso-height-percent:0;mso-wrap-distance-left:9pt;mso-wrap-distance-top:0;mso-wrap-distance-right:9pt;mso-wrap-distance-bottom:0;mso-position-horizontal:absolute;mso-position-horizontal-relative:text;mso-position-vertical:absolute;mso-position-vertical-relative:text;mso-width-percent:0;mso-height-percent:0;mso-width-relative:margin;mso-height-relative:margin;v-text-anchor:middle" arcsize="10923f" o:gfxdata="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" filled="f" strokecolor="#e00" strokeweight="1.5pt">
+              <v:roundrect w14:anchorId="3BF9581D" id="Rounded Rectangle 40" o:spid="_x0000_s1040" style="position:absolute;margin-left:472.65pt;margin-top:254.2pt;width:18.4pt;height:18.8pt;z-index:251658290;visibility:visible;mso-wrap-style:square;mso-width-percent:0;mso-height-percent:0;mso-wrap-distance-left:9pt;mso-wrap-distance-top:0;mso-wrap-distance-right:9pt;mso-wrap-distance-bottom:0;mso-position-horizontal:absolute;mso-position-horizontal-relative:text;mso-position-vertical:absolute;mso-position-vertical-relative:text;mso-width-percent:0;mso-height-percent:0;mso-width-relative:margin;mso-height-relative:margin;v-text-anchor:middle" arcsize="10923f" o:gfxdata="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" filled="f" strokecolor="#e00" strokeweight="1.5pt">
                 <v:stroke joinstyle="miter"/>
                 <v:textbox inset="0,0,0,0">
                   <w:txbxContent>
@@ -9467,7 +9505,7 @@
           </mc:Choice>
           <mc:Fallback>
             <w:pict>
-              <v:roundrect w14:anchorId="028EE442" id="_x0000_s1040" style="position:absolute;margin-left:186pt;margin-top:154.3pt;width:18.4pt;height:18.8pt;z-index:251658291;visibility:visible;mso-wrap-style:square;mso-width-percent:0;mso-height-percent:0;mso-wrap-distance-left:9pt;mso-wrap-distance-top:0;mso-wrap-distance-right:9pt;mso-wrap-distance-bottom:0;mso-position-horizontal:absolute;mso-position-horizontal-relative:text;mso-position-vertical:absolute;mso-position-vertical-relative:text;mso-width-percent:0;mso-height-percent:0;mso-width-relative:margin;mso-height-relative:margin;v-text-anchor:middle" arcsize="10923f" o:gfxdata="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" filled="f" strokecolor="#e00" strokeweight="1.5pt">
+              <v:roundrect w14:anchorId="028EE442" id="_x0000_s1041" style="position:absolute;margin-left:186pt;margin-top:154.3pt;width:18.4pt;height:18.8pt;z-index:251658291;visibility:visible;mso-wrap-style:square;mso-width-percent:0;mso-height-percent:0;mso-wrap-distance-left:9pt;mso-wrap-distance-top:0;mso-wrap-distance-right:9pt;mso-wrap-distance-bottom:0;mso-position-horizontal:absolute;mso-position-horizontal-relative:text;mso-position-vertical:absolute;mso-position-vertical-relative:text;mso-width-percent:0;mso-height-percent:0;mso-width-relative:margin;mso-height-relative:margin;v-text-anchor:middle" arcsize="10923f" o:gfxdata="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" filled="f" strokecolor="#e00" strokeweight="1.5pt">
                 <v:stroke joinstyle="miter"/>
                 <v:textbox inset="0,0,0,0">
                   <w:txbxContent>
@@ -9605,7 +9643,7 @@
           </mc:Choice>
           <mc:Fallback>
             <w:pict>
-              <v:roundrect w14:anchorId="4ABBA9AE" id="_x0000_s1041" style="position:absolute;margin-left:631pt;margin-top:158.5pt;width:18.4pt;height:18.8pt;z-index:251658289;visibility:visible;mso-wrap-style:square;mso-width-percent:0;mso-height-percent:0;mso-wrap-distance-left:9pt;mso-wrap-distance-top:0;mso-wrap-distance-right:9pt;mso-wrap-distance-bottom:0;mso-position-horizontal:absolute;mso-position-horizontal-relative:text;mso-position-vertical:absolute;mso-position-vertical-relative:text;mso-width-percent:0;mso-height-percent:0;mso-width-relative:margin;mso-height-relative:margin;v-text-anchor:middle" arcsize="10923f" o:gfxdata="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" filled="f" strokecolor="#e00" strokeweight="1.5pt">
+              <v:roundrect w14:anchorId="4ABBA9AE" id="_x0000_s1042" style="position:absolute;margin-left:631pt;margin-top:158.5pt;width:18.4pt;height:18.8pt;z-index:251658289;visibility:visible;mso-wrap-style:square;mso-width-percent:0;mso-height-percent:0;mso-wrap-distance-left:9pt;mso-wrap-distance-top:0;mso-wrap-distance-right:9pt;mso-wrap-distance-bottom:0;mso-position-horizontal:absolute;mso-position-horizontal-relative:text;mso-position-vertical:absolute;mso-position-vertical-relative:text;mso-width-percent:0;mso-height-percent:0;mso-width-relative:margin;mso-height-relative:margin;v-text-anchor:middle" arcsize="10923f" o:gfxdata="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" filled="f" strokecolor="#e00" strokeweight="1.5pt">
                 <v:stroke joinstyle="miter"/>
                 <v:textbox inset="0,0,0,0">
                   <w:txbxContent>
@@ -10006,7 +10044,7 @@
           </mc:Choice>
           <mc:Fallback>
             <w:pict>
-              <v:shape w14:anchorId="50525D99" id="_x0000_s1042" type="#_x0000_t202" style="position:absolute;margin-left:-.1pt;margin-top:78.25pt;width:63pt;height:18pt;z-index:251663411;visibility:visible;mso-wrap-style:square;mso-width-percent:0;mso-height-percent:0;mso-wrap-distance-left:9pt;mso-wrap-distance-top:0;mso-wrap-distance-right:9pt;mso-wrap-distance-bottom:0;mso-position-horizontal:absolute;mso-position-horizontal-relative:text;mso-position-vertical:absolute;mso-position-vertical-relative:page;mso-width-percent:0;mso-height-percent:0;mso-width-relative:margin;mso-height-relative:margin;v-text-anchor:middle" o:gfxdata="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" filled="f" stroked="f" strokeweight=".5pt">
+              <v:shape w14:anchorId="50525D99" id="_x0000_s1043" type="#_x0000_t202" style="position:absolute;margin-left:-.1pt;margin-top:78.25pt;width:63pt;height:18pt;z-index:251663411;visibility:visible;mso-wrap-style:square;mso-width-percent:0;mso-height-percent:0;mso-wrap-distance-left:9pt;mso-wrap-distance-top:0;mso-wrap-distance-right:9pt;mso-wrap-distance-bottom:0;mso-position-horizontal:absolute;mso-position-horizontal-relative:text;mso-position-vertical:absolute;mso-position-vertical-relative:page;mso-width-percent:0;mso-height-percent:0;mso-width-relative:margin;mso-height-relative:margin;v-text-anchor:middle" o:gfxdata="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" filled="f" stroked="f" strokeweight=".5pt">
                 <v:textbox inset="0,0,0,0">
                   <w:txbxContent>
                     <w:p>
@@ -10632,7 +10670,7 @@
           </mc:Choice>
           <mc:Fallback>
             <w:pict>
-              <v:shape w14:anchorId="7E1A0749" id="_x0000_s1043" type="#_x0000_t202" style="position:absolute;margin-left:-.25pt;margin-top:397.8pt;width:63pt;height:18pt;z-index:251667507;visibility:visible;mso-wrap-style:square;mso-width-percent:0;mso-height-percent:0;mso-wrap-distance-left:9pt;mso-wrap-distance-top:0;mso-wrap-distance-right:9pt;mso-wrap-distance-bottom:0;mso-position-horizontal:absolute;mso-position-horizontal-relative:text;mso-position-vertical:absolute;mso-position-vertical-relative:page;mso-width-percent:0;mso-height-percent:0;mso-width-relative:margin;mso-height-relative:margin;v-text-anchor:middle" o:gfxdata="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" filled="f" stroked="f" strokeweight=".5pt">
+              <v:shape w14:anchorId="7E1A0749" id="_x0000_s1044" type="#_x0000_t202" style="position:absolute;margin-left:-.25pt;margin-top:397.8pt;width:63pt;height:18pt;z-index:251667507;visibility:visible;mso-wrap-style:square;mso-width-percent:0;mso-height-percent:0;mso-wrap-distance-left:9pt;mso-wrap-distance-top:0;mso-wrap-distance-right:9pt;mso-wrap-distance-bottom:0;mso-position-horizontal:absolute;mso-position-horizontal-relative:text;mso-position-vertical:absolute;mso-position-vertical-relative:page;mso-width-percent:0;mso-height-percent:0;mso-width-relative:margin;mso-height-relative:margin;v-text-anchor:middle" o:gfxdata="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" filled="f" stroked="f" strokeweight=".5pt">
                 <v:textbox inset="0,0,0,0">
                   <w:txbxContent>
                     <w:p>
@@ -10748,7 +10786,7 @@
           <w:noProof/>
         </w:rPr>
         <w:drawing>
-          <wp:anchor distT="0" distB="0" distL="114300" distR="114300" simplePos="0" relativeHeight="251670579" behindDoc="0" locked="0" layoutInCell="1" allowOverlap="1" wp14:anchorId="4D4488F9" wp14:editId="5CD8F0CC">
+          <wp:anchor distT="0" distB="0" distL="114300" distR="114300" simplePos="0" relativeHeight="251670579" behindDoc="0" locked="0" layoutInCell="1" allowOverlap="1" wp14:anchorId="4D4488F9" wp14:editId="755B43FF">
             <wp:simplePos x="0" y="0"/>
             <wp:positionH relativeFrom="column">
               <wp:posOffset>7205382</wp:posOffset>
@@ -10808,7 +10846,7 @@
           <w:noProof/>
         </w:rPr>
         <w:drawing>
-          <wp:anchor distT="0" distB="0" distL="114300" distR="114300" simplePos="0" relativeHeight="251672627" behindDoc="0" locked="0" layoutInCell="1" allowOverlap="1" wp14:anchorId="3C967CD3" wp14:editId="49B5C1CF">
+          <wp:anchor distT="0" distB="0" distL="114300" distR="114300" simplePos="0" relativeHeight="251672627" behindDoc="0" locked="0" layoutInCell="1" allowOverlap="1" wp14:anchorId="3C967CD3" wp14:editId="3391A45D">
             <wp:simplePos x="0" y="0"/>
             <wp:positionH relativeFrom="column">
               <wp:posOffset>1943735</wp:posOffset>
@@ -10868,7 +10906,7 @@
           <w:noProof/>
         </w:rPr>
         <w:drawing>
-          <wp:anchor distT="0" distB="0" distL="114300" distR="114300" simplePos="0" relativeHeight="251671603" behindDoc="0" locked="0" layoutInCell="1" allowOverlap="1" wp14:anchorId="5E361213" wp14:editId="7BFD9122">
+          <wp:anchor distT="0" distB="0" distL="114300" distR="114300" simplePos="0" relativeHeight="251671603" behindDoc="0" locked="0" layoutInCell="1" allowOverlap="1" wp14:anchorId="5E361213" wp14:editId="0A8536BD">
             <wp:simplePos x="0" y="0"/>
             <wp:positionH relativeFrom="column">
               <wp:posOffset>4512945</wp:posOffset>
@@ -10965,7 +11003,7 @@
         <mc:AlternateContent>
           <mc:Choice Requires="wps">
             <w:drawing>
-              <wp:anchor distT="0" distB="0" distL="114300" distR="114300" simplePos="0" relativeHeight="251677747" behindDoc="0" locked="0" layoutInCell="1" allowOverlap="1" wp14:anchorId="3BC4AC9D" wp14:editId="06926D2F">
+              <wp:anchor distT="0" distB="0" distL="114300" distR="114300" simplePos="0" relativeHeight="251677747" behindDoc="0" locked="0" layoutInCell="1" allowOverlap="1" wp14:anchorId="3BC4AC9D" wp14:editId="14DA17C7">
                 <wp:simplePos x="0" y="0"/>
                 <wp:positionH relativeFrom="column">
                   <wp:posOffset>7620</wp:posOffset>
@@ -11027,7 +11065,7 @@
           </mc:Choice>
           <mc:Fallback>
             <w:pict>
-              <v:shape w14:anchorId="3BC4AC9D" id="_x0000_s1044" type="#_x0000_t202" style="position:absolute;margin-left:.6pt;margin-top:78.15pt;width:63pt;height:18pt;z-index:251677747;visibility:visible;mso-wrap-style:square;mso-width-percent:0;mso-height-percent:0;mso-wrap-distance-left:9pt;mso-wrap-distance-top:0;mso-wrap-distance-right:9pt;mso-wrap-distance-bottom:0;mso-position-horizontal:absolute;mso-position-horizontal-relative:text;mso-position-vertical:absolute;mso-position-vertical-relative:page;mso-width-percent:0;mso-height-percent:0;mso-width-relative:margin;mso-height-relative:margin;v-text-anchor:middle" o:gfxdata="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" filled="f" stroked="f" strokeweight=".5pt">
+              <v:shape w14:anchorId="3BC4AC9D" id="_x0000_s1045" type="#_x0000_t202" style="position:absolute;margin-left:.6pt;margin-top:78.15pt;width:63pt;height:18pt;z-index:251677747;visibility:visible;mso-wrap-style:square;mso-width-percent:0;mso-height-percent:0;mso-wrap-distance-left:9pt;mso-wrap-distance-top:0;mso-wrap-distance-right:9pt;mso-wrap-distance-bottom:0;mso-position-horizontal:absolute;mso-position-horizontal-relative:text;mso-position-vertical:absolute;mso-position-vertical-relative:page;mso-width-percent:0;mso-height-percent:0;mso-width-relative:margin;mso-height-relative:margin;v-text-anchor:middle" o:gfxdata="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" filled="f" stroked="f" strokeweight=".5pt">
                 <v:textbox inset="0,0,0,0">
                   <w:txbxContent>
                     <w:p>
@@ -11139,8 +11177,162 @@
         <w:rPr>
           <w:noProof/>
         </w:rPr>
+        <mc:AlternateContent>
+          <mc:Choice Requires="wps">
+            <w:drawing>
+              <wp:anchor distT="0" distB="0" distL="114300" distR="114300" simplePos="0" relativeHeight="251686963" behindDoc="0" locked="0" layoutInCell="1" allowOverlap="1" wp14:anchorId="6B90E587" wp14:editId="454D0F53">
+                <wp:simplePos x="0" y="0"/>
+                <wp:positionH relativeFrom="column">
+                  <wp:posOffset>5847976</wp:posOffset>
+                </wp:positionH>
+                <wp:positionV relativeFrom="paragraph">
+                  <wp:posOffset>1051971</wp:posOffset>
+                </wp:positionV>
+                <wp:extent cx="495897" cy="148665"/>
+                <wp:effectExtent l="12700" t="12700" r="12700" b="54610"/>
+                <wp:wrapNone/>
+                <wp:docPr id="1732241400" name="Straight Arrow Connector 37"/>
+                <wp:cNvGraphicFramePr/>
+                <a:graphic xmlns:a="http://schemas.openxmlformats.org/drawingml/2006/main">
+                  <a:graphicData uri="http://schemas.microsoft.com/office/word/2010/wordprocessingShape">
+                    <wps:wsp>
+                      <wps:cNvCnPr/>
+                      <wps:spPr>
+                        <a:xfrm flipH="1">
+                          <a:off x="0" y="0"/>
+                          <a:ext cx="495897" cy="148665"/>
+                        </a:xfrm>
+                        <a:prstGeom prst="straightConnector1">
+                          <a:avLst/>
+                        </a:prstGeom>
+                        <a:ln w="38100">
+                          <a:solidFill>
+                            <a:srgbClr val="EE0000"/>
+                          </a:solidFill>
+                          <a:tailEnd type="triangle"/>
+                        </a:ln>
+                      </wps:spPr>
+                      <wps:style>
+                        <a:lnRef idx="1">
+                          <a:schemeClr val="accent1"/>
+                        </a:lnRef>
+                        <a:fillRef idx="0">
+                          <a:schemeClr val="accent1"/>
+                        </a:fillRef>
+                        <a:effectRef idx="0">
+                          <a:schemeClr val="accent1"/>
+                        </a:effectRef>
+                        <a:fontRef idx="minor">
+                          <a:schemeClr val="tx1"/>
+                        </a:fontRef>
+                      </wps:style>
+                      <wps:bodyPr/>
+                    </wps:wsp>
+                  </a:graphicData>
+                </a:graphic>
+                <wp14:sizeRelH relativeFrom="margin">
+                  <wp14:pctWidth>0</wp14:pctWidth>
+                </wp14:sizeRelH>
+                <wp14:sizeRelV relativeFrom="margin">
+                  <wp14:pctHeight>0</wp14:pctHeight>
+                </wp14:sizeRelV>
+              </wp:anchor>
+            </w:drawing>
+          </mc:Choice>
+          <mc:Fallback>
+            <w:pict>
+              <v:shapetype w14:anchorId="5BEC8F7C" id="_x0000_t32" coordsize="21600,21600" o:spt="32" o:oned="t" path="m,l21600,21600e" filled="f">
+                <v:path arrowok="t" fillok="f" o:connecttype="none"/>
+                <o:lock v:ext="edit" shapetype="t"/>
+              </v:shapetype>
+              <v:shape id="Straight Arrow Connector 37" o:spid="_x0000_s1026" type="#_x0000_t32" style="position:absolute;margin-left:460.45pt;margin-top:82.85pt;width:39.05pt;height:11.7pt;flip:x;z-index:251686963;visibility:visible;mso-wrap-style:square;mso-width-percent:0;mso-height-percent:0;mso-wrap-distance-left:9pt;mso-wrap-distance-top:0;mso-wrap-distance-right:9pt;mso-wrap-distance-bottom:0;mso-position-horizontal:absolute;mso-position-horizontal-relative:text;mso-position-vertical:absolute;mso-position-vertical-relative:text;mso-width-percent:0;mso-height-percent:0;mso-width-relative:margin;mso-height-relative:margin" o:gfxdata="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" strokecolor="#e00" strokeweight="3pt">
+                <v:stroke endarrow="block" joinstyle="miter"/>
+              </v:shape>
+            </w:pict>
+          </mc:Fallback>
+        </mc:AlternateContent>
+      </w:r>
+      <w:r>
+        <w:rPr>
+          <w:noProof/>
+        </w:rPr>
+        <mc:AlternateContent>
+          <mc:Choice Requires="wps">
+            <w:drawing>
+              <wp:anchor distT="0" distB="0" distL="114300" distR="114300" simplePos="0" relativeHeight="251684915" behindDoc="0" locked="0" layoutInCell="1" allowOverlap="1" wp14:anchorId="5714D165" wp14:editId="7C4900C2">
+                <wp:simplePos x="0" y="0"/>
+                <wp:positionH relativeFrom="column">
+                  <wp:posOffset>5768788</wp:posOffset>
+                </wp:positionH>
+                <wp:positionV relativeFrom="paragraph">
+                  <wp:posOffset>594024</wp:posOffset>
+                </wp:positionV>
+                <wp:extent cx="564777" cy="92000"/>
+                <wp:effectExtent l="0" t="25400" r="32385" b="73660"/>
+                <wp:wrapNone/>
+                <wp:docPr id="472808856" name="Straight Arrow Connector 37"/>
+                <wp:cNvGraphicFramePr/>
+                <a:graphic xmlns:a="http://schemas.openxmlformats.org/drawingml/2006/main">
+                  <a:graphicData uri="http://schemas.microsoft.com/office/word/2010/wordprocessingShape">
+                    <wps:wsp>
+                      <wps:cNvCnPr/>
+                      <wps:spPr>
+                        <a:xfrm>
+                          <a:off x="0" y="0"/>
+                          <a:ext cx="564777" cy="92000"/>
+                        </a:xfrm>
+                        <a:prstGeom prst="straightConnector1">
+                          <a:avLst/>
+                        </a:prstGeom>
+                        <a:ln w="38100">
+                          <a:solidFill>
+                            <a:srgbClr val="EE0000"/>
+                          </a:solidFill>
+                          <a:tailEnd type="triangle"/>
+                        </a:ln>
+                      </wps:spPr>
+                      <wps:style>
+                        <a:lnRef idx="1">
+                          <a:schemeClr val="accent1"/>
+                        </a:lnRef>
+                        <a:fillRef idx="0">
+                          <a:schemeClr val="accent1"/>
+                        </a:fillRef>
+                        <a:effectRef idx="0">
+                          <a:schemeClr val="accent1"/>
+                        </a:effectRef>
+                        <a:fontRef idx="minor">
+                          <a:schemeClr val="tx1"/>
+                        </a:fontRef>
+                      </wps:style>
+                      <wps:bodyPr/>
+                    </wps:wsp>
+                  </a:graphicData>
+                </a:graphic>
+                <wp14:sizeRelH relativeFrom="margin">
+                  <wp14:pctWidth>0</wp14:pctWidth>
+                </wp14:sizeRelH>
+                <wp14:sizeRelV relativeFrom="margin">
+                  <wp14:pctHeight>0</wp14:pctHeight>
+                </wp14:sizeRelV>
+              </wp:anchor>
+            </w:drawing>
+          </mc:Choice>
+          <mc:Fallback>
+            <w:pict>
+              <v:shape w14:anchorId="5DB48939" id="Straight Arrow Connector 37" o:spid="_x0000_s1026" type="#_x0000_t32" style="position:absolute;margin-left:454.25pt;margin-top:46.75pt;width:44.45pt;height:7.25pt;z-index:251684915;visibility:visible;mso-wrap-style:square;mso-width-percent:0;mso-height-percent:0;mso-wrap-distance-left:9pt;mso-wrap-distance-top:0;mso-wrap-distance-right:9pt;mso-wrap-distance-bottom:0;mso-position-horizontal:absolute;mso-position-horizontal-relative:text;mso-position-vertical:absolute;mso-position-vertical-relative:text;mso-width-percent:0;mso-height-percent:0;mso-width-relative:margin;mso-height-relative:margin" o:gfxdata="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" strokecolor="#e00" strokeweight="3pt">
+                <v:stroke endarrow="block" joinstyle="miter"/>
+              </v:shape>
+            </w:pict>
+          </mc:Fallback>
+        </mc:AlternateContent>
+      </w:r>
+      <w:r>
+        <w:rPr>
+          <w:noProof/>
+        </w:rPr>
         <w:drawing>
-          <wp:anchor distT="0" distB="0" distL="114300" distR="114300" simplePos="0" relativeHeight="251680819" behindDoc="0" locked="0" layoutInCell="1" allowOverlap="1" wp14:anchorId="3BA53904" wp14:editId="427D3981">
+          <wp:anchor distT="0" distB="0" distL="114300" distR="114300" simplePos="0" relativeHeight="251680819" behindDoc="0" locked="0" layoutInCell="1" allowOverlap="1" wp14:anchorId="3BA53904" wp14:editId="326D9E73">
             <wp:simplePos x="0" y="0"/>
             <wp:positionH relativeFrom="column">
               <wp:posOffset>6330315</wp:posOffset>
@@ -11200,7 +11392,7 @@
           <w:noProof/>
         </w:rPr>
         <w:drawing>
-          <wp:anchor distT="0" distB="0" distL="114300" distR="114300" simplePos="0" relativeHeight="251678771" behindDoc="0" locked="0" layoutInCell="1" allowOverlap="1" wp14:anchorId="2C2E8FF9" wp14:editId="5AAA49AB">
+          <wp:anchor distT="0" distB="0" distL="114300" distR="114300" simplePos="0" relativeHeight="251678771" behindDoc="0" locked="0" layoutInCell="1" allowOverlap="1" wp14:anchorId="2C2E8FF9" wp14:editId="4F18B509">
             <wp:simplePos x="0" y="0"/>
             <wp:positionH relativeFrom="column">
               <wp:posOffset>1943100</wp:posOffset>
@@ -11209,7 +11401,7 @@
               <wp:posOffset>1063527</wp:posOffset>
             </wp:positionV>
             <wp:extent cx="4288155" cy="1143000"/>
-            <wp:effectExtent l="0" t="0" r="4445" b="0"/>
+            <wp:effectExtent l="12700" t="12700" r="17145" b="12700"/>
             <wp:wrapSquare wrapText="bothSides"/>
             <wp:docPr id="385560351" name="Picture 1" descr="A screenshot of a social media post&#10;&#10;AI-generated content may be incorrect."/>
             <wp:cNvGraphicFramePr>
@@ -11242,6 +11434,11 @@
                     <a:prstGeom prst="rect">
                       <a:avLst/>
                     </a:prstGeom>
+                    <a:ln>
+                      <a:solidFill>
+                        <a:schemeClr val="tx1"/>
+                      </a:solidFill>
+                    </a:ln>
                   </pic:spPr>
                 </pic:pic>
               </a:graphicData>
@@ -11441,7 +11638,7 @@
           <w:noProof/>
         </w:rPr>
         <w:drawing>
-          <wp:anchor distT="0" distB="0" distL="114300" distR="114300" simplePos="0" relativeHeight="251679795" behindDoc="0" locked="0" layoutInCell="1" allowOverlap="1" wp14:anchorId="0EF7A829" wp14:editId="6D149D9C">
+          <wp:anchor distT="0" distB="0" distL="114300" distR="114300" simplePos="0" relativeHeight="251679795" behindDoc="0" locked="0" layoutInCell="1" allowOverlap="1" wp14:anchorId="0EF7A829" wp14:editId="73A34F1E">
             <wp:simplePos x="0" y="0"/>
             <wp:positionH relativeFrom="column">
               <wp:posOffset>1943100</wp:posOffset>
@@ -11497,12 +11694,679 @@
         </w:drawing>
       </w:r>
     </w:p>
+    <w:p>
+      <w:r>
+        <w:rPr>
+          <w:noProof/>
+        </w:rPr>
+        <w:drawing>
+          <wp:anchor distT="0" distB="0" distL="114300" distR="114300" simplePos="0" relativeHeight="251681843" behindDoc="0" locked="0" layoutInCell="1" allowOverlap="1" wp14:anchorId="34137E9F" wp14:editId="130BEAD4">
+            <wp:simplePos x="0" y="0"/>
+            <wp:positionH relativeFrom="column">
+              <wp:posOffset>5638800</wp:posOffset>
+            </wp:positionH>
+            <wp:positionV relativeFrom="paragraph">
+              <wp:posOffset>303530</wp:posOffset>
+            </wp:positionV>
+            <wp:extent cx="4072255" cy="1488440"/>
+            <wp:effectExtent l="12700" t="12700" r="17145" b="10160"/>
+            <wp:wrapSquare wrapText="bothSides"/>
+            <wp:docPr id="1488329068" name="Picture 1" descr="A screenshot of a computer program&#10;&#10;AI-generated content may be incorrect."/>
+            <wp:cNvGraphicFramePr>
+              <a:graphicFrameLocks xmlns:a="http://schemas.openxmlformats.org/drawingml/2006/main" noChangeAspect="1"/>
+            </wp:cNvGraphicFramePr>
+            <a:graphic xmlns:a="http://schemas.openxmlformats.org/drawingml/2006/main">
+              <a:graphicData uri="http://schemas.openxmlformats.org/drawingml/2006/picture">
+                <pic:pic xmlns:pic="http://schemas.openxmlformats.org/drawingml/2006/picture">
+                  <pic:nvPicPr>
+                    <pic:cNvPr id="1488329068" name="Picture 1" descr="A screenshot of a computer program&#10;&#10;AI-generated content may be incorrect."/>
+                    <pic:cNvPicPr/>
+                  </pic:nvPicPr>
+                  <pic:blipFill rotWithShape="1">
+                    <a:blip r:embed="rId37" cstate="print">
+                      <a:extLst>
+                        <a:ext uri="{28A0092B-C50C-407E-A947-70E740481C1C}">
+                          <a14:useLocalDpi xmlns:a14="http://schemas.microsoft.com/office/drawing/2010/main" val="0"/>
+                        </a:ext>
+                      </a:extLst>
+                    </a:blip>
+                    <a:srcRect b="25441"/>
+                    <a:stretch>
+                      <a:fillRect/>
+                    </a:stretch>
+                  </pic:blipFill>
+                  <pic:spPr bwMode="auto">
+                    <a:xfrm>
+                      <a:off x="0" y="0"/>
+                      <a:ext cx="4072255" cy="1488440"/>
+                    </a:xfrm>
+                    <a:prstGeom prst="rect">
+                      <a:avLst/>
+                    </a:prstGeom>
+                    <a:ln w="9525" cap="flat" cmpd="sng" algn="ctr">
+                      <a:solidFill>
+                        <a:sysClr val="windowText" lastClr="000000"/>
+                      </a:solidFill>
+                      <a:prstDash val="solid"/>
+                      <a:round/>
+                      <a:headEnd type="none" w="med" len="med"/>
+                      <a:tailEnd type="none" w="med" len="med"/>
+                      <a:extLst>
+                        <a:ext uri="{C807C97D-BFC1-408E-A445-0C87EB9F89A2}">
+                          <ask:lineSketchStyleProps xmlns:ask="http://schemas.microsoft.com/office/drawing/2018/sketchyshapes" sd="0">
+                            <a:custGeom>
+                              <a:avLst/>
+                              <a:gdLst/>
+                              <a:ahLst/>
+                              <a:cxnLst/>
+                              <a:rect l="0" t="0" r="0" b="0"/>
+                              <a:pathLst/>
+                            </a:custGeom>
+                            <ask:type/>
+                          </ask:lineSketchStyleProps>
+                        </a:ext>
+                      </a:extLst>
+                    </a:ln>
+                    <a:extLst>
+                      <a:ext uri="{53640926-AAD7-44D8-BBD7-CCE9431645EC}">
+                        <a14:shadowObscured xmlns:a14="http://schemas.microsoft.com/office/drawing/2010/main"/>
+                      </a:ext>
+                    </a:extLst>
+                  </pic:spPr>
+                </pic:pic>
+              </a:graphicData>
+            </a:graphic>
+            <wp14:sizeRelH relativeFrom="page">
+              <wp14:pctWidth>0</wp14:pctWidth>
+            </wp14:sizeRelH>
+            <wp14:sizeRelV relativeFrom="page">
+              <wp14:pctHeight>0</wp14:pctHeight>
+            </wp14:sizeRelV>
+          </wp:anchor>
+        </w:drawing>
+      </w:r>
+      <w:r>
+        <w:rPr>
+          <w:noProof/>
+        </w:rPr>
+        <w:drawing>
+          <wp:anchor distT="0" distB="0" distL="114300" distR="114300" simplePos="0" relativeHeight="251682867" behindDoc="0" locked="0" layoutInCell="1" allowOverlap="1" wp14:anchorId="0A23BEAD" wp14:editId="0CAA649B">
+            <wp:simplePos x="0" y="0"/>
+            <wp:positionH relativeFrom="column">
+              <wp:posOffset>1940560</wp:posOffset>
+            </wp:positionH>
+            <wp:positionV relativeFrom="paragraph">
+              <wp:posOffset>20320</wp:posOffset>
+            </wp:positionV>
+            <wp:extent cx="3545205" cy="1772285"/>
+            <wp:effectExtent l="0" t="0" r="0" b="5715"/>
+            <wp:wrapNone/>
+            <wp:docPr id="963594360" name="Picture 51" descr="A screenshot of a computer&#10;&#10;AI-generated content may be incorrect."/>
+            <wp:cNvGraphicFramePr>
+              <a:graphicFrameLocks xmlns:a="http://schemas.openxmlformats.org/drawingml/2006/main" noChangeAspect="1"/>
+            </wp:cNvGraphicFramePr>
+            <a:graphic xmlns:a="http://schemas.openxmlformats.org/drawingml/2006/main">
+              <a:graphicData uri="http://schemas.openxmlformats.org/drawingml/2006/picture">
+                <pic:pic xmlns:pic="http://schemas.openxmlformats.org/drawingml/2006/picture">
+                  <pic:nvPicPr>
+                    <pic:cNvPr id="963594360" name="Picture 51" descr="A screenshot of a computer&#10;&#10;AI-generated content may be incorrect."/>
+                    <pic:cNvPicPr/>
+                  </pic:nvPicPr>
+                  <pic:blipFill rotWithShape="1">
+                    <a:blip r:embed="rId38" cstate="print">
+                      <a:extLst>
+                        <a:ext uri="{28A0092B-C50C-407E-A947-70E740481C1C}">
+                          <a14:useLocalDpi xmlns:a14="http://schemas.microsoft.com/office/drawing/2010/main" val="0"/>
+                        </a:ext>
+                      </a:extLst>
+                    </a:blip>
+                    <a:srcRect t="1" b="50748"/>
+                    <a:stretch>
+                      <a:fillRect/>
+                    </a:stretch>
+                  </pic:blipFill>
+                  <pic:spPr bwMode="auto">
+                    <a:xfrm>
+                      <a:off x="0" y="0"/>
+                      <a:ext cx="3545205" cy="1772285"/>
+                    </a:xfrm>
+                    <a:prstGeom prst="rect">
+                      <a:avLst/>
+                    </a:prstGeom>
+                    <a:ln>
+                      <a:noFill/>
+                    </a:ln>
+                    <a:extLst>
+                      <a:ext uri="{53640926-AAD7-44D8-BBD7-CCE9431645EC}">
+                        <a14:shadowObscured xmlns:a14="http://schemas.microsoft.com/office/drawing/2010/main"/>
+                      </a:ext>
+                    </a:extLst>
+                  </pic:spPr>
+                </pic:pic>
+              </a:graphicData>
+            </a:graphic>
+            <wp14:sizeRelH relativeFrom="page">
+              <wp14:pctWidth>0</wp14:pctWidth>
+            </wp14:sizeRelH>
+            <wp14:sizeRelV relativeFrom="page">
+              <wp14:pctHeight>0</wp14:pctHeight>
+            </wp14:sizeRelV>
+          </wp:anchor>
+        </w:drawing>
+      </w:r>
+      <w:r>
+        <w:rPr>
+          <w:noProof/>
+        </w:rPr>
+        <mc:AlternateContent>
+          <mc:Choice Requires="wps">
+            <w:drawing>
+              <wp:anchor distT="0" distB="0" distL="114300" distR="114300" simplePos="0" relativeHeight="251689011" behindDoc="0" locked="0" layoutInCell="1" allowOverlap="1" wp14:anchorId="532378CF" wp14:editId="01CCFCE2">
+                <wp:simplePos x="0" y="0"/>
+                <wp:positionH relativeFrom="column">
+                  <wp:posOffset>3517271</wp:posOffset>
+                </wp:positionH>
+                <wp:positionV relativeFrom="paragraph">
+                  <wp:posOffset>151652</wp:posOffset>
+                </wp:positionV>
+                <wp:extent cx="2172832" cy="910753"/>
+                <wp:effectExtent l="12700" t="12700" r="50165" b="41910"/>
+                <wp:wrapNone/>
+                <wp:docPr id="2027373577" name="Straight Arrow Connector 37"/>
+                <wp:cNvGraphicFramePr/>
+                <a:graphic xmlns:a="http://schemas.openxmlformats.org/drawingml/2006/main">
+                  <a:graphicData uri="http://schemas.microsoft.com/office/word/2010/wordprocessingShape">
+                    <wps:wsp>
+                      <wps:cNvCnPr/>
+                      <wps:spPr>
+                        <a:xfrm>
+                          <a:off x="0" y="0"/>
+                          <a:ext cx="2172832" cy="910753"/>
+                        </a:xfrm>
+                        <a:prstGeom prst="straightConnector1">
+                          <a:avLst/>
+                        </a:prstGeom>
+                        <a:ln w="38100">
+                          <a:solidFill>
+                            <a:srgbClr val="EE0000"/>
+                          </a:solidFill>
+                          <a:tailEnd type="triangle"/>
+                        </a:ln>
+                      </wps:spPr>
+                      <wps:style>
+                        <a:lnRef idx="1">
+                          <a:schemeClr val="accent1"/>
+                        </a:lnRef>
+                        <a:fillRef idx="0">
+                          <a:schemeClr val="accent1"/>
+                        </a:fillRef>
+                        <a:effectRef idx="0">
+                          <a:schemeClr val="accent1"/>
+                        </a:effectRef>
+                        <a:fontRef idx="minor">
+                          <a:schemeClr val="tx1"/>
+                        </a:fontRef>
+                      </wps:style>
+                      <wps:bodyPr/>
+                    </wps:wsp>
+                  </a:graphicData>
+                </a:graphic>
+                <wp14:sizeRelH relativeFrom="margin">
+                  <wp14:pctWidth>0</wp14:pctWidth>
+                </wp14:sizeRelH>
+                <wp14:sizeRelV relativeFrom="margin">
+                  <wp14:pctHeight>0</wp14:pctHeight>
+                </wp14:sizeRelV>
+              </wp:anchor>
+            </w:drawing>
+          </mc:Choice>
+          <mc:Fallback>
+            <w:pict>
+              <v:shapetype w14:anchorId="15A70095" id="_x0000_t32" coordsize="21600,21600" o:spt="32" o:oned="t" path="m,l21600,21600e" filled="f">
+                <v:path arrowok="t" fillok="f" o:connecttype="none"/>
+                <o:lock v:ext="edit" shapetype="t"/>
+              </v:shapetype>
+              <v:shape id="Straight Arrow Connector 37" o:spid="_x0000_s1026" type="#_x0000_t32" style="position:absolute;margin-left:276.95pt;margin-top:11.95pt;width:171.1pt;height:71.7pt;z-index:251689011;visibility:visible;mso-wrap-style:square;mso-width-percent:0;mso-height-percent:0;mso-wrap-distance-left:9pt;mso-wrap-distance-top:0;mso-wrap-distance-right:9pt;mso-wrap-distance-bottom:0;mso-position-horizontal:absolute;mso-position-horizontal-relative:text;mso-position-vertical:absolute;mso-position-vertical-relative:text;mso-width-percent:0;mso-height-percent:0;mso-width-relative:margin;mso-height-relative:margin" o:gfxdata="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" strokecolor="#e00" strokeweight="3pt">
+                <v:stroke endarrow="block" joinstyle="miter"/>
+              </v:shape>
+            </w:pict>
+          </mc:Fallback>
+        </mc:AlternateContent>
+      </w:r>
+    </w:p>
+    <w:p/>
+    <w:p/>
+    <w:p/>
     <w:p/>
     <w:p/>
     <w:p>
+      <w:r>
+        <w:rPr>
+          <w:noProof/>
+        </w:rPr>
+        <w:drawing>
+          <wp:anchor distT="0" distB="0" distL="114300" distR="114300" simplePos="0" relativeHeight="251700275" behindDoc="0" locked="0" layoutInCell="1" allowOverlap="1" wp14:anchorId="0D0A2E28" wp14:editId="1E3A04F4">
+            <wp:simplePos x="0" y="0"/>
+            <wp:positionH relativeFrom="column">
+              <wp:posOffset>6122283</wp:posOffset>
+            </wp:positionH>
+            <wp:positionV relativeFrom="paragraph">
+              <wp:posOffset>508635</wp:posOffset>
+            </wp:positionV>
+            <wp:extent cx="3368040" cy="536575"/>
+            <wp:effectExtent l="0" t="0" r="0" b="0"/>
+            <wp:wrapNone/>
+            <wp:docPr id="728911280" name="Picture 58" descr="A black background with white text&#10;&#10;AI-generated content may be incorrect."/>
+            <wp:cNvGraphicFramePr>
+              <a:graphicFrameLocks xmlns:a="http://schemas.openxmlformats.org/drawingml/2006/main" noChangeAspect="1"/>
+            </wp:cNvGraphicFramePr>
+            <a:graphic xmlns:a="http://schemas.openxmlformats.org/drawingml/2006/main">
+              <a:graphicData uri="http://schemas.openxmlformats.org/drawingml/2006/picture">
+                <pic:pic xmlns:pic="http://schemas.openxmlformats.org/drawingml/2006/picture">
+                  <pic:nvPicPr>
+                    <pic:cNvPr id="728911280" name="Picture 58" descr="A black background with white text&#10;&#10;AI-generated content may be incorrect."/>
+                    <pic:cNvPicPr/>
+                  </pic:nvPicPr>
+                  <pic:blipFill>
+                    <a:blip r:embed="rId39" cstate="print">
+                      <a:extLst>
+                        <a:ext uri="{28A0092B-C50C-407E-A947-70E740481C1C}">
+                          <a14:useLocalDpi xmlns:a14="http://schemas.microsoft.com/office/drawing/2010/main" val="0"/>
+                        </a:ext>
+                      </a:extLst>
+                    </a:blip>
+                    <a:stretch>
+                      <a:fillRect/>
+                    </a:stretch>
+                  </pic:blipFill>
+                  <pic:spPr>
+                    <a:xfrm>
+                      <a:off x="0" y="0"/>
+                      <a:ext cx="3368040" cy="536575"/>
+                    </a:xfrm>
+                    <a:prstGeom prst="rect">
+                      <a:avLst/>
+                    </a:prstGeom>
+                  </pic:spPr>
+                </pic:pic>
+              </a:graphicData>
+            </a:graphic>
+            <wp14:sizeRelH relativeFrom="page">
+              <wp14:pctWidth>0</wp14:pctWidth>
+            </wp14:sizeRelH>
+            <wp14:sizeRelV relativeFrom="page">
+              <wp14:pctHeight>0</wp14:pctHeight>
+            </wp14:sizeRelV>
+          </wp:anchor>
+        </w:drawing>
+      </w:r>
+      <w:r>
+        <w:rPr>
+          <w:noProof/>
+        </w:rPr>
+        <w:drawing>
+          <wp:anchor distT="0" distB="0" distL="114300" distR="114300" simplePos="0" relativeHeight="251702323" behindDoc="0" locked="0" layoutInCell="1" allowOverlap="1" wp14:anchorId="641AF614" wp14:editId="1CAF2EED">
+            <wp:simplePos x="0" y="0"/>
+            <wp:positionH relativeFrom="column">
+              <wp:posOffset>1944030</wp:posOffset>
+            </wp:positionH>
+            <wp:positionV relativeFrom="paragraph">
+              <wp:posOffset>516023</wp:posOffset>
+            </wp:positionV>
+            <wp:extent cx="2627484" cy="1019407"/>
+            <wp:effectExtent l="0" t="0" r="1905" b="0"/>
+            <wp:wrapNone/>
+            <wp:docPr id="302491048" name="Picture 55" descr="A screenshot of a computer&#10;&#10;AI-generated content may be incorrect."/>
+            <wp:cNvGraphicFramePr>
+              <a:graphicFrameLocks xmlns:a="http://schemas.openxmlformats.org/drawingml/2006/main" noChangeAspect="1"/>
+            </wp:cNvGraphicFramePr>
+            <a:graphic xmlns:a="http://schemas.openxmlformats.org/drawingml/2006/main">
+              <a:graphicData uri="http://schemas.openxmlformats.org/drawingml/2006/picture">
+                <pic:pic xmlns:pic="http://schemas.openxmlformats.org/drawingml/2006/picture">
+                  <pic:nvPicPr>
+                    <pic:cNvPr id="302491048" name="Picture 55" descr="A screenshot of a computer&#10;&#10;AI-generated content may be incorrect."/>
+                    <pic:cNvPicPr/>
+                  </pic:nvPicPr>
+                  <pic:blipFill rotWithShape="1">
+                    <a:blip r:embed="rId40" cstate="print">
+                      <a:extLst>
+                        <a:ext uri="{28A0092B-C50C-407E-A947-70E740481C1C}">
+                          <a14:useLocalDpi xmlns:a14="http://schemas.microsoft.com/office/drawing/2010/main" val="0"/>
+                        </a:ext>
+                      </a:extLst>
+                    </a:blip>
+                    <a:srcRect b="33489"/>
+                    <a:stretch>
+                      <a:fillRect/>
+                    </a:stretch>
+                  </pic:blipFill>
+                  <pic:spPr bwMode="auto">
+                    <a:xfrm>
+                      <a:off x="0" y="0"/>
+                      <a:ext cx="2707532" cy="1050464"/>
+                    </a:xfrm>
+                    <a:prstGeom prst="rect">
+                      <a:avLst/>
+                    </a:prstGeom>
+                    <a:ln>
+                      <a:noFill/>
+                    </a:ln>
+                    <a:extLst>
+                      <a:ext uri="{53640926-AAD7-44D8-BBD7-CCE9431645EC}">
+                        <a14:shadowObscured xmlns:a14="http://schemas.microsoft.com/office/drawing/2010/main"/>
+                      </a:ext>
+                    </a:extLst>
+                  </pic:spPr>
+                </pic:pic>
+              </a:graphicData>
+            </a:graphic>
+            <wp14:sizeRelH relativeFrom="page">
+              <wp14:pctWidth>0</wp14:pctWidth>
+            </wp14:sizeRelH>
+            <wp14:sizeRelV relativeFrom="page">
+              <wp14:pctHeight>0</wp14:pctHeight>
+            </wp14:sizeRelV>
+          </wp:anchor>
+        </w:drawing>
+      </w:r>
+      <w:r>
+        <w:br/>
+        <w:t xml:space="preserve">Sprint 2: </w:t>
+      </w:r>
+      <w:r>
+        <w:t>Wire the frontend to the backend to get real data</w:t>
+      </w:r>
+    </w:p>
+    <w:p/>
+    <w:p>
+      <w:r>
+        <w:drawing>
+          <wp:anchor distT="0" distB="0" distL="114300" distR="114300" simplePos="0" relativeHeight="251708467" behindDoc="0" locked="0" layoutInCell="1" allowOverlap="1" wp14:anchorId="6AF26E7C" wp14:editId="75EE7162">
+            <wp:simplePos x="0" y="0"/>
+            <wp:positionH relativeFrom="column">
+              <wp:posOffset>6515100</wp:posOffset>
+            </wp:positionH>
+            <wp:positionV relativeFrom="paragraph">
+              <wp:posOffset>301581</wp:posOffset>
+            </wp:positionV>
+            <wp:extent cx="2976565" cy="726483"/>
+            <wp:effectExtent l="0" t="0" r="0" b="0"/>
+            <wp:wrapNone/>
+            <wp:docPr id="561626620" name="Picture 1" descr="A screenshot of a phone&#10;&#10;AI-generated content may be incorrect."/>
+            <wp:cNvGraphicFramePr>
+              <a:graphicFrameLocks xmlns:a="http://schemas.openxmlformats.org/drawingml/2006/main" noChangeAspect="1"/>
+            </wp:cNvGraphicFramePr>
+            <a:graphic xmlns:a="http://schemas.openxmlformats.org/drawingml/2006/main">
+              <a:graphicData uri="http://schemas.openxmlformats.org/drawingml/2006/picture">
+                <pic:pic xmlns:pic="http://schemas.openxmlformats.org/drawingml/2006/picture">
+                  <pic:nvPicPr>
+                    <pic:cNvPr id="561626620" name="Picture 1" descr="A screenshot of a phone&#10;&#10;AI-generated content may be incorrect."/>
+                    <pic:cNvPicPr/>
+                  </pic:nvPicPr>
+                  <pic:blipFill>
+                    <a:blip r:embed="rId41" cstate="print">
+                      <a:extLst>
+                        <a:ext uri="{28A0092B-C50C-407E-A947-70E740481C1C}">
+                          <a14:useLocalDpi xmlns:a14="http://schemas.microsoft.com/office/drawing/2010/main" val="0"/>
+                        </a:ext>
+                      </a:extLst>
+                    </a:blip>
+                    <a:stretch>
+                      <a:fillRect/>
+                    </a:stretch>
+                  </pic:blipFill>
+                  <pic:spPr>
+                    <a:xfrm>
+                      <a:off x="0" y="0"/>
+                      <a:ext cx="3018136" cy="736629"/>
+                    </a:xfrm>
+                    <a:prstGeom prst="rect">
+                      <a:avLst/>
+                    </a:prstGeom>
+                  </pic:spPr>
+                </pic:pic>
+              </a:graphicData>
+            </a:graphic>
+            <wp14:sizeRelH relativeFrom="page">
+              <wp14:pctWidth>0</wp14:pctWidth>
+            </wp14:sizeRelH>
+            <wp14:sizeRelV relativeFrom="page">
+              <wp14:pctHeight>0</wp14:pctHeight>
+            </wp14:sizeRelV>
+          </wp:anchor>
+        </w:drawing>
+      </w:r>
+      <w:r>
+        <w:rPr>
+          <w:noProof/>
+        </w:rPr>
+        <mc:AlternateContent>
+          <mc:Choice Requires="wps">
+            <w:drawing>
+              <wp:anchor distT="0" distB="0" distL="114300" distR="114300" simplePos="0" relativeHeight="251705395" behindDoc="0" locked="0" layoutInCell="1" allowOverlap="1" wp14:anchorId="5AB4871D" wp14:editId="6BE2AEE6">
+                <wp:simplePos x="0" y="0"/>
+                <wp:positionH relativeFrom="column">
+                  <wp:posOffset>3946911</wp:posOffset>
+                </wp:positionH>
+                <wp:positionV relativeFrom="paragraph">
+                  <wp:posOffset>3655</wp:posOffset>
+                </wp:positionV>
+                <wp:extent cx="2710366" cy="189230"/>
+                <wp:effectExtent l="25400" t="12700" r="20320" b="77470"/>
+                <wp:wrapNone/>
+                <wp:docPr id="1592474305" name="Straight Arrow Connector 37"/>
+                <wp:cNvGraphicFramePr/>
+                <a:graphic xmlns:a="http://schemas.openxmlformats.org/drawingml/2006/main">
+                  <a:graphicData uri="http://schemas.microsoft.com/office/word/2010/wordprocessingShape">
+                    <wps:wsp>
+                      <wps:cNvCnPr/>
+                      <wps:spPr>
+                        <a:xfrm flipH="1">
+                          <a:off x="0" y="0"/>
+                          <a:ext cx="2710366" cy="189230"/>
+                        </a:xfrm>
+                        <a:prstGeom prst="straightConnector1">
+                          <a:avLst/>
+                        </a:prstGeom>
+                        <a:ln w="38100">
+                          <a:solidFill>
+                            <a:srgbClr val="EE0000"/>
+                          </a:solidFill>
+                          <a:tailEnd type="triangle"/>
+                        </a:ln>
+                      </wps:spPr>
+                      <wps:style>
+                        <a:lnRef idx="1">
+                          <a:schemeClr val="accent1"/>
+                        </a:lnRef>
+                        <a:fillRef idx="0">
+                          <a:schemeClr val="accent1"/>
+                        </a:fillRef>
+                        <a:effectRef idx="0">
+                          <a:schemeClr val="accent1"/>
+                        </a:effectRef>
+                        <a:fontRef idx="minor">
+                          <a:schemeClr val="tx1"/>
+                        </a:fontRef>
+                      </wps:style>
+                      <wps:bodyPr/>
+                    </wps:wsp>
+                  </a:graphicData>
+                </a:graphic>
+                <wp14:sizeRelH relativeFrom="margin">
+                  <wp14:pctWidth>0</wp14:pctWidth>
+                </wp14:sizeRelH>
+                <wp14:sizeRelV relativeFrom="margin">
+                  <wp14:pctHeight>0</wp14:pctHeight>
+                </wp14:sizeRelV>
+              </wp:anchor>
+            </w:drawing>
+          </mc:Choice>
+          <mc:Fallback>
+            <w:pict>
+              <v:shape w14:anchorId="415040F4" id="Straight Arrow Connector 37" o:spid="_x0000_s1026" type="#_x0000_t32" style="position:absolute;margin-left:310.8pt;margin-top:.3pt;width:213.4pt;height:14.9pt;flip:x;z-index:251705395;visibility:visible;mso-wrap-style:square;mso-width-percent:0;mso-height-percent:0;mso-wrap-distance-left:9pt;mso-wrap-distance-top:0;mso-wrap-distance-right:9pt;mso-wrap-distance-bottom:0;mso-position-horizontal:absolute;mso-position-horizontal-relative:text;mso-position-vertical:absolute;mso-position-vertical-relative:text;mso-width-percent:0;mso-height-percent:0;mso-width-relative:margin;mso-height-relative:margin" o:gfxdata="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" strokecolor="#e00" strokeweight="3pt">
+                <v:stroke endarrow="block" joinstyle="miter"/>
+              </v:shape>
+            </w:pict>
+          </mc:Fallback>
+        </mc:AlternateContent>
+      </w:r>
+      <w:r>
+        <w:rPr>
+          <w:noProof/>
+        </w:rPr>
+        <mc:AlternateContent>
+          <mc:Choice Requires="wps">
+            <w:drawing>
+              <wp:anchor distT="0" distB="0" distL="114300" distR="114300" simplePos="0" relativeHeight="251707443" behindDoc="0" locked="0" layoutInCell="1" allowOverlap="1" wp14:anchorId="141FF3B4" wp14:editId="1EC6B20A">
+                <wp:simplePos x="0" y="0"/>
+                <wp:positionH relativeFrom="column">
+                  <wp:posOffset>5768277</wp:posOffset>
+                </wp:positionH>
+                <wp:positionV relativeFrom="paragraph">
+                  <wp:posOffset>192994</wp:posOffset>
+                </wp:positionV>
+                <wp:extent cx="710581" cy="665387"/>
+                <wp:effectExtent l="25400" t="12700" r="26035" b="33655"/>
+                <wp:wrapNone/>
+                <wp:docPr id="1226127957" name="Straight Arrow Connector 37"/>
+                <wp:cNvGraphicFramePr/>
+                <a:graphic xmlns:a="http://schemas.openxmlformats.org/drawingml/2006/main">
+                  <a:graphicData uri="http://schemas.microsoft.com/office/word/2010/wordprocessingShape">
+                    <wps:wsp>
+                      <wps:cNvCnPr/>
+                      <wps:spPr>
+                        <a:xfrm flipH="1">
+                          <a:off x="0" y="0"/>
+                          <a:ext cx="710581" cy="665387"/>
+                        </a:xfrm>
+                        <a:prstGeom prst="straightConnector1">
+                          <a:avLst/>
+                        </a:prstGeom>
+                        <a:ln w="38100">
+                          <a:solidFill>
+                            <a:srgbClr val="EE0000"/>
+                          </a:solidFill>
+                          <a:tailEnd type="triangle"/>
+                        </a:ln>
+                      </wps:spPr>
+                      <wps:style>
+                        <a:lnRef idx="1">
+                          <a:schemeClr val="accent1"/>
+                        </a:lnRef>
+                        <a:fillRef idx="0">
+                          <a:schemeClr val="accent1"/>
+                        </a:fillRef>
+                        <a:effectRef idx="0">
+                          <a:schemeClr val="accent1"/>
+                        </a:effectRef>
+                        <a:fontRef idx="minor">
+                          <a:schemeClr val="tx1"/>
+                        </a:fontRef>
+                      </wps:style>
+                      <wps:bodyPr/>
+                    </wps:wsp>
+                  </a:graphicData>
+                </a:graphic>
+                <wp14:sizeRelH relativeFrom="margin">
+                  <wp14:pctWidth>0</wp14:pctWidth>
+                </wp14:sizeRelH>
+                <wp14:sizeRelV relativeFrom="margin">
+                  <wp14:pctHeight>0</wp14:pctHeight>
+                </wp14:sizeRelV>
+              </wp:anchor>
+            </w:drawing>
+          </mc:Choice>
+          <mc:Fallback>
+            <w:pict>
+              <v:shape w14:anchorId="38DB28C5" id="Straight Arrow Connector 37" o:spid="_x0000_s1026" type="#_x0000_t32" style="position:absolute;margin-left:454.2pt;margin-top:15.2pt;width:55.95pt;height:52.4pt;flip:x;z-index:251707443;visibility:visible;mso-wrap-style:square;mso-width-percent:0;mso-height-percent:0;mso-wrap-distance-left:9pt;mso-wrap-distance-top:0;mso-wrap-distance-right:9pt;mso-wrap-distance-bottom:0;mso-position-horizontal:absolute;mso-position-horizontal-relative:text;mso-position-vertical:absolute;mso-position-vertical-relative:text;mso-width-percent:0;mso-height-percent:0;mso-width-relative:margin;mso-height-relative:margin" o:gfxdata="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" strokecolor="#e00" strokeweight="3pt">
+                <v:stroke endarrow="block" joinstyle="miter"/>
+              </v:shape>
+            </w:pict>
+          </mc:Fallback>
+        </mc:AlternateContent>
+      </w:r>
+      <w:r>
+        <w:rPr>
+          <w:noProof/>
+        </w:rPr>
+        <w:drawing>
+          <wp:anchor distT="0" distB="0" distL="114300" distR="114300" simplePos="0" relativeHeight="251703347" behindDoc="0" locked="0" layoutInCell="1" allowOverlap="1" wp14:anchorId="26F1AC04" wp14:editId="498B33D8">
+            <wp:simplePos x="0" y="0"/>
+            <wp:positionH relativeFrom="column">
+              <wp:posOffset>4457700</wp:posOffset>
+            </wp:positionH>
+            <wp:positionV relativeFrom="paragraph">
+              <wp:posOffset>258306</wp:posOffset>
+            </wp:positionV>
+            <wp:extent cx="1826926" cy="772562"/>
+            <wp:effectExtent l="0" t="0" r="1905" b="2540"/>
+            <wp:wrapNone/>
+            <wp:docPr id="1720444718" name="Picture 56" descr="A screenshot of a computer&#10;&#10;AI-generated content may be incorrect."/>
+            <wp:cNvGraphicFramePr>
+              <a:graphicFrameLocks xmlns:a="http://schemas.openxmlformats.org/drawingml/2006/main" noChangeAspect="1"/>
+            </wp:cNvGraphicFramePr>
+            <a:graphic xmlns:a="http://schemas.openxmlformats.org/drawingml/2006/main">
+              <a:graphicData uri="http://schemas.openxmlformats.org/drawingml/2006/picture">
+                <pic:pic xmlns:pic="http://schemas.openxmlformats.org/drawingml/2006/picture">
+                  <pic:nvPicPr>
+                    <pic:cNvPr id="1720444718" name="Picture 56" descr="A screenshot of a computer&#10;&#10;AI-generated content may be incorrect."/>
+                    <pic:cNvPicPr/>
+                  </pic:nvPicPr>
+                  <pic:blipFill rotWithShape="1">
+                    <a:blip r:embed="rId42" cstate="print">
+                      <a:extLst>
+                        <a:ext uri="{28A0092B-C50C-407E-A947-70E740481C1C}">
+                          <a14:useLocalDpi xmlns:a14="http://schemas.microsoft.com/office/drawing/2010/main" val="0"/>
+                        </a:ext>
+                      </a:extLst>
+                    </a:blip>
+                    <a:srcRect r="25044" b="45662"/>
+                    <a:stretch>
+                      <a:fillRect/>
+                    </a:stretch>
+                  </pic:blipFill>
+                  <pic:spPr bwMode="auto">
+                    <a:xfrm>
+                      <a:off x="0" y="0"/>
+                      <a:ext cx="1922406" cy="812938"/>
+                    </a:xfrm>
+                    <a:prstGeom prst="rect">
+                      <a:avLst/>
+                    </a:prstGeom>
+                    <a:ln>
+                      <a:noFill/>
+                    </a:ln>
+                    <a:extLst>
+                      <a:ext uri="{53640926-AAD7-44D8-BBD7-CCE9431645EC}">
+                        <a14:shadowObscured xmlns:a14="http://schemas.microsoft.com/office/drawing/2010/main"/>
+                      </a:ext>
+                    </a:extLst>
+                  </pic:spPr>
+                </pic:pic>
+              </a:graphicData>
+            </a:graphic>
+            <wp14:sizeRelH relativeFrom="page">
+              <wp14:pctWidth>0</wp14:pctWidth>
+            </wp14:sizeRelH>
+            <wp14:sizeRelV relativeFrom="page">
+              <wp14:pctHeight>0</wp14:pctHeight>
+            </wp14:sizeRelV>
+          </wp:anchor>
+        </w:drawing>
+      </w:r>
+    </w:p>
+    <w:p>
+      <w:r>
+        <w:br w:type="page"/>
+      </w:r>
+    </w:p>
+    <w:p/>
+    <w:p/>
+    <w:p>
       <w:pPr>
         <w:sectPr>
-          <w:footerReference w:type="first" r:id="rId37"/>
+          <w:footerReference w:type="first" r:id="rId43"/>
           <w:pgSz w:w="16838" w:h="11906" w:orient="landscape"/>
           <w:pgMar w:top="720" w:right="720" w:bottom="720" w:left="720" w:header="720" w:footer="720" w:gutter="0"/>
           <w:cols w:space="720"/>
@@ -11511,7 +12375,7 @@
         </w:sectPr>
       </w:pPr>
     </w:p>
-    <w:bookmarkStart w:id="17" w:name="_Toc220332546" w:displacedByCustomXml="next"/>
+    <w:bookmarkStart w:id="19" w:name="_Toc220332546" w:displacedByCustomXml="next"/>
     <w:sdt>
       <w:sdtPr>
         <w:rPr>
@@ -11534,7 +12398,7 @@
           <w:r>
             <w:t>Appendix</w:t>
           </w:r>
-          <w:bookmarkEnd w:id="17"/>
+          <w:bookmarkEnd w:id="19"/>
         </w:p>
         <w:sdt>
           <w:sdtPr>

</xml_diff>

<commit_message>
Display cover photos; CreatePlace API and tests
</commit_message>
<xml_diff>
--- a/docs/730087020 ECM3432DA Software Engineering 1 Agile Development Exercise.docx
+++ b/docs/730087020 ECM3432DA Software Engineering 1 Agile Development Exercise.docx
@@ -5614,7 +5614,7 @@
           <w:noProof/>
         </w:rPr>
         <w:drawing>
-          <wp:anchor distT="0" distB="0" distL="114300" distR="114300" simplePos="0" relativeHeight="251658257" behindDoc="0" locked="0" layoutInCell="1" allowOverlap="1" wp14:anchorId="68A71638" wp14:editId="4507EA61">
+          <wp:anchor distT="0" distB="0" distL="114300" distR="114300" simplePos="0" relativeHeight="251658257" behindDoc="0" locked="0" layoutInCell="1" allowOverlap="1" wp14:anchorId="68A71638" wp14:editId="0E2FF64F">
             <wp:simplePos x="0" y="0"/>
             <wp:positionH relativeFrom="column">
               <wp:posOffset>6290310</wp:posOffset>
@@ -8039,7 +8039,7 @@
           <w:noProof/>
         </w:rPr>
         <w:drawing>
-          <wp:anchor distT="0" distB="0" distL="114300" distR="114300" simplePos="0" relativeHeight="251658271" behindDoc="0" locked="0" layoutInCell="1" allowOverlap="1" wp14:anchorId="23C35C18" wp14:editId="16FEB8E5">
+          <wp:anchor distT="0" distB="0" distL="114300" distR="114300" simplePos="0" relativeHeight="251658271" behindDoc="0" locked="0" layoutInCell="1" allowOverlap="1" wp14:anchorId="23C35C18" wp14:editId="57AFCBF2">
             <wp:simplePos x="0" y="0"/>
             <wp:positionH relativeFrom="column">
               <wp:posOffset>1829697</wp:posOffset>
@@ -8610,7 +8610,7 @@
           <w:noProof/>
         </w:rPr>
         <w:drawing>
-          <wp:anchor distT="0" distB="0" distL="114300" distR="114300" simplePos="0" relativeHeight="251658274" behindDoc="0" locked="0" layoutInCell="1" allowOverlap="1" wp14:anchorId="1C8242DE" wp14:editId="494C8107">
+          <wp:anchor distT="0" distB="0" distL="114300" distR="114300" simplePos="0" relativeHeight="251658274" behindDoc="0" locked="0" layoutInCell="1" allowOverlap="1" wp14:anchorId="1C8242DE" wp14:editId="0D6786EC">
             <wp:simplePos x="0" y="0"/>
             <wp:positionH relativeFrom="column">
               <wp:posOffset>4455160</wp:posOffset>
@@ -10786,7 +10786,7 @@
           <w:noProof/>
         </w:rPr>
         <w:drawing>
-          <wp:anchor distT="0" distB="0" distL="114300" distR="114300" simplePos="0" relativeHeight="251670579" behindDoc="0" locked="0" layoutInCell="1" allowOverlap="1" wp14:anchorId="4D4488F9" wp14:editId="755B43FF">
+          <wp:anchor distT="0" distB="0" distL="114300" distR="114300" simplePos="0" relativeHeight="251670579" behindDoc="0" locked="0" layoutInCell="1" allowOverlap="1" wp14:anchorId="4D4488F9" wp14:editId="257B7C98">
             <wp:simplePos x="0" y="0"/>
             <wp:positionH relativeFrom="column">
               <wp:posOffset>7205382</wp:posOffset>
@@ -10846,7 +10846,7 @@
           <w:noProof/>
         </w:rPr>
         <w:drawing>
-          <wp:anchor distT="0" distB="0" distL="114300" distR="114300" simplePos="0" relativeHeight="251672627" behindDoc="0" locked="0" layoutInCell="1" allowOverlap="1" wp14:anchorId="3C967CD3" wp14:editId="3391A45D">
+          <wp:anchor distT="0" distB="0" distL="114300" distR="114300" simplePos="0" relativeHeight="251672627" behindDoc="0" locked="0" layoutInCell="1" allowOverlap="1" wp14:anchorId="3C967CD3" wp14:editId="2B7AEA4E">
             <wp:simplePos x="0" y="0"/>
             <wp:positionH relativeFrom="column">
               <wp:posOffset>1943735</wp:posOffset>
@@ -10906,7 +10906,7 @@
           <w:noProof/>
         </w:rPr>
         <w:drawing>
-          <wp:anchor distT="0" distB="0" distL="114300" distR="114300" simplePos="0" relativeHeight="251671603" behindDoc="0" locked="0" layoutInCell="1" allowOverlap="1" wp14:anchorId="5E361213" wp14:editId="0A8536BD">
+          <wp:anchor distT="0" distB="0" distL="114300" distR="114300" simplePos="0" relativeHeight="251671603" behindDoc="0" locked="0" layoutInCell="1" allowOverlap="1" wp14:anchorId="5E361213" wp14:editId="31EB5078">
             <wp:simplePos x="0" y="0"/>
             <wp:positionH relativeFrom="column">
               <wp:posOffset>4512945</wp:posOffset>
@@ -11700,7 +11700,7 @@
           <w:noProof/>
         </w:rPr>
         <w:drawing>
-          <wp:anchor distT="0" distB="0" distL="114300" distR="114300" simplePos="0" relativeHeight="251681843" behindDoc="0" locked="0" layoutInCell="1" allowOverlap="1" wp14:anchorId="34137E9F" wp14:editId="130BEAD4">
+          <wp:anchor distT="0" distB="0" distL="114300" distR="114300" simplePos="0" relativeHeight="251681843" behindDoc="0" locked="0" layoutInCell="1" allowOverlap="1" wp14:anchorId="34137E9F" wp14:editId="4C534783">
             <wp:simplePos x="0" y="0"/>
             <wp:positionH relativeFrom="column">
               <wp:posOffset>5638800</wp:posOffset>
@@ -11944,19 +11944,197 @@
         <w:rPr>
           <w:noProof/>
         </w:rPr>
+        <mc:AlternateContent>
+          <mc:Choice Requires="wps">
+            <w:drawing>
+              <wp:anchor distT="0" distB="0" distL="114300" distR="114300" simplePos="0" relativeHeight="251711539" behindDoc="0" locked="0" layoutInCell="1" allowOverlap="1" wp14:anchorId="0919259F" wp14:editId="0397FAB8">
+                <wp:simplePos x="0" y="0"/>
+                <wp:positionH relativeFrom="column">
+                  <wp:posOffset>7620</wp:posOffset>
+                </wp:positionH>
+                <wp:positionV relativeFrom="page">
+                  <wp:posOffset>5441950</wp:posOffset>
+                </wp:positionV>
+                <wp:extent cx="800100" cy="228600"/>
+                <wp:effectExtent l="0" t="0" r="0" b="0"/>
+                <wp:wrapNone/>
+                <wp:docPr id="1817033125" name="Text Box 5"/>
+                <wp:cNvGraphicFramePr/>
+                <a:graphic xmlns:a="http://schemas.openxmlformats.org/drawingml/2006/main">
+                  <a:graphicData uri="http://schemas.microsoft.com/office/word/2010/wordprocessingShape">
+                    <wps:wsp>
+                      <wps:cNvSpPr txBox="1"/>
+                      <wps:spPr>
+                        <a:xfrm>
+                          <a:off x="0" y="0"/>
+                          <a:ext cx="800100" cy="228600"/>
+                        </a:xfrm>
+                        <a:prstGeom prst="rect">
+                          <a:avLst/>
+                        </a:prstGeom>
+                        <a:noFill/>
+                        <a:ln w="6350">
+                          <a:noFill/>
+                        </a:ln>
+                      </wps:spPr>
+                      <wps:txbx>
+                        <w:txbxContent>
+                          <w:p>
+                            <w:pPr>
+                              <w:jc w:val="right"/>
+                            </w:pPr>
+                            <w:r>
+                              <w:t xml:space="preserve">February </w:t>
+                            </w:r>
+                            <w:r>
+                              <w:t>23</w:t>
+                            </w:r>
+                          </w:p>
+                        </w:txbxContent>
+                      </wps:txbx>
+                      <wps:bodyPr rot="0" spcFirstLastPara="0" vertOverflow="overflow" horzOverflow="overflow" vert="horz" wrap="square" lIns="0" tIns="0" rIns="0" bIns="0" numCol="1" spcCol="0" rtlCol="0" fromWordArt="0" anchor="ctr" anchorCtr="0" forceAA="0" compatLnSpc="1">
+                        <a:prstTxWarp prst="textNoShape">
+                          <a:avLst/>
+                        </a:prstTxWarp>
+                        <a:noAutofit/>
+                      </wps:bodyPr>
+                    </wps:wsp>
+                  </a:graphicData>
+                </a:graphic>
+                <wp14:sizeRelH relativeFrom="margin">
+                  <wp14:pctWidth>0</wp14:pctWidth>
+                </wp14:sizeRelH>
+                <wp14:sizeRelV relativeFrom="margin">
+                  <wp14:pctHeight>0</wp14:pctHeight>
+                </wp14:sizeRelV>
+              </wp:anchor>
+            </w:drawing>
+          </mc:Choice>
+          <mc:Fallback>
+            <w:pict>
+              <v:shape w14:anchorId="0919259F" id="_x0000_s1046" type="#_x0000_t202" style="position:absolute;margin-left:.6pt;margin-top:428.5pt;width:63pt;height:18pt;z-index:251711539;visibility:visible;mso-wrap-style:square;mso-width-percent:0;mso-height-percent:0;mso-wrap-distance-left:9pt;mso-wrap-distance-top:0;mso-wrap-distance-right:9pt;mso-wrap-distance-bottom:0;mso-position-horizontal:absolute;mso-position-horizontal-relative:text;mso-position-vertical:absolute;mso-position-vertical-relative:page;mso-width-percent:0;mso-height-percent:0;mso-width-relative:margin;mso-height-relative:margin;v-text-anchor:middle" o:gfxdata="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" filled="f" stroked="f" strokeweight=".5pt">
+                <v:textbox inset="0,0,0,0">
+                  <w:txbxContent>
+                    <w:p>
+                      <w:pPr>
+                        <w:jc w:val="right"/>
+                      </w:pPr>
+                      <w:r>
+                        <w:t xml:space="preserve">February </w:t>
+                      </w:r>
+                      <w:r>
+                        <w:t>23</w:t>
+                      </w:r>
+                    </w:p>
+                  </w:txbxContent>
+                </v:textbox>
+                <w10:wrap anchory="page"/>
+              </v:shape>
+            </w:pict>
+          </mc:Fallback>
+        </mc:AlternateContent>
+      </w:r>
+      <w:r>
+        <w:rPr>
+          <w:noProof/>
+        </w:rPr>
+        <mc:AlternateContent>
+          <mc:Choice Requires="wps">
+            <w:drawing>
+              <wp:anchor distT="0" distB="0" distL="114300" distR="114300" simplePos="0" relativeHeight="251710515" behindDoc="0" locked="0" layoutInCell="1" allowOverlap="1" wp14:anchorId="57EB02A3" wp14:editId="3467F943">
+                <wp:simplePos x="0" y="0"/>
+                <wp:positionH relativeFrom="column">
+                  <wp:posOffset>995045</wp:posOffset>
+                </wp:positionH>
+                <wp:positionV relativeFrom="page">
+                  <wp:posOffset>5417796</wp:posOffset>
+                </wp:positionV>
+                <wp:extent cx="251460" cy="251460"/>
+                <wp:effectExtent l="25400" t="25400" r="40640" b="40640"/>
+                <wp:wrapNone/>
+                <wp:docPr id="60340853" name="Oval 4"/>
+                <wp:cNvGraphicFramePr/>
+                <a:graphic xmlns:a="http://schemas.openxmlformats.org/drawingml/2006/main">
+                  <a:graphicData uri="http://schemas.microsoft.com/office/word/2010/wordprocessingShape">
+                    <wps:wsp>
+                      <wps:cNvSpPr/>
+                      <wps:spPr>
+                        <a:xfrm>
+                          <a:off x="0" y="0"/>
+                          <a:ext cx="251460" cy="251460"/>
+                        </a:xfrm>
+                        <a:prstGeom prst="ellipse">
+                          <a:avLst/>
+                        </a:prstGeom>
+                        <a:solidFill>
+                          <a:schemeClr val="bg1"/>
+                        </a:solidFill>
+                        <a:ln w="57150">
+                          <a:solidFill>
+                            <a:schemeClr val="accent1">
+                              <a:lumMod val="75000"/>
+                            </a:schemeClr>
+                          </a:solidFill>
+                        </a:ln>
+                      </wps:spPr>
+                      <wps:style>
+                        <a:lnRef idx="2">
+                          <a:schemeClr val="accent1">
+                            <a:shade val="15000"/>
+                          </a:schemeClr>
+                        </a:lnRef>
+                        <a:fillRef idx="1">
+                          <a:schemeClr val="accent1"/>
+                        </a:fillRef>
+                        <a:effectRef idx="0">
+                          <a:schemeClr val="accent1"/>
+                        </a:effectRef>
+                        <a:fontRef idx="minor">
+                          <a:schemeClr val="lt1"/>
+                        </a:fontRef>
+                      </wps:style>
+                      <wps:bodyPr rot="0" spcFirstLastPara="0" vertOverflow="overflow" horzOverflow="overflow" vert="horz" wrap="square" lIns="91440" tIns="45720" rIns="91440" bIns="45720" numCol="1" spcCol="0" rtlCol="0" fromWordArt="0" anchor="ctr" anchorCtr="0" forceAA="0" compatLnSpc="1">
+                        <a:prstTxWarp prst="textNoShape">
+                          <a:avLst/>
+                        </a:prstTxWarp>
+                        <a:noAutofit/>
+                      </wps:bodyPr>
+                    </wps:wsp>
+                  </a:graphicData>
+                </a:graphic>
+                <wp14:sizeRelH relativeFrom="margin">
+                  <wp14:pctWidth>0</wp14:pctWidth>
+                </wp14:sizeRelH>
+                <wp14:sizeRelV relativeFrom="margin">
+                  <wp14:pctHeight>0</wp14:pctHeight>
+                </wp14:sizeRelV>
+              </wp:anchor>
+            </w:drawing>
+          </mc:Choice>
+          <mc:Fallback>
+            <w:pict>
+              <v:oval w14:anchorId="5786C16B" id="Oval 4" o:spid="_x0000_s1026" style="position:absolute;margin-left:78.35pt;margin-top:426.6pt;width:19.8pt;height:19.8pt;z-index:251710515;visibility:visible;mso-wrap-style:square;mso-width-percent:0;mso-height-percent:0;mso-wrap-distance-left:9pt;mso-wrap-distance-top:0;mso-wrap-distance-right:9pt;mso-wrap-distance-bottom:0;mso-position-horizontal:absolute;mso-position-horizontal-relative:text;mso-position-vertical:absolute;mso-position-vertical-relative:page;mso-width-percent:0;mso-height-percent:0;mso-width-relative:margin;mso-height-relative:margin;v-text-anchor:middle" o:gfxdata="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" fillcolor="white [3212]" strokecolor="#0f4761 [2404]" strokeweight="4.5pt">
+                <v:stroke joinstyle="miter"/>
+                <w10:wrap anchory="page"/>
+              </v:oval>
+            </w:pict>
+          </mc:Fallback>
+        </mc:AlternateContent>
+      </w:r>
+      <w:r>
         <w:drawing>
-          <wp:anchor distT="0" distB="0" distL="114300" distR="114300" simplePos="0" relativeHeight="251700275" behindDoc="0" locked="0" layoutInCell="1" allowOverlap="1" wp14:anchorId="0D0A2E28" wp14:editId="1E3A04F4">
+          <wp:anchor distT="0" distB="0" distL="114300" distR="114300" simplePos="0" relativeHeight="251657215" behindDoc="0" locked="0" layoutInCell="1" allowOverlap="1" wp14:anchorId="3122B99C" wp14:editId="7E102473">
             <wp:simplePos x="0" y="0"/>
             <wp:positionH relativeFrom="column">
-              <wp:posOffset>6122283</wp:posOffset>
+              <wp:posOffset>6476365</wp:posOffset>
             </wp:positionH>
             <wp:positionV relativeFrom="paragraph">
-              <wp:posOffset>508635</wp:posOffset>
+              <wp:posOffset>519102</wp:posOffset>
             </wp:positionV>
-            <wp:extent cx="3368040" cy="536575"/>
-            <wp:effectExtent l="0" t="0" r="0" b="0"/>
+            <wp:extent cx="3236686" cy="558852"/>
+            <wp:effectExtent l="0" t="0" r="1905" b="0"/>
             <wp:wrapNone/>
-            <wp:docPr id="728911280" name="Picture 58" descr="A black background with white text&#10;&#10;AI-generated content may be incorrect."/>
+            <wp:docPr id="1628595985" name="Picture 1" descr="A black text on a white background&#10;&#10;AI-generated content may be incorrect."/>
             <wp:cNvGraphicFramePr>
               <a:graphicFrameLocks xmlns:a="http://schemas.openxmlformats.org/drawingml/2006/main" noChangeAspect="1"/>
             </wp:cNvGraphicFramePr>
@@ -11964,7 +12142,7 @@
               <a:graphicData uri="http://schemas.openxmlformats.org/drawingml/2006/picture">
                 <pic:pic xmlns:pic="http://schemas.openxmlformats.org/drawingml/2006/picture">
                   <pic:nvPicPr>
-                    <pic:cNvPr id="728911280" name="Picture 58" descr="A black background with white text&#10;&#10;AI-generated content may be incorrect."/>
+                    <pic:cNvPr id="1628595985" name="Picture 1" descr="A black text on a white background&#10;&#10;AI-generated content may be incorrect."/>
                     <pic:cNvPicPr/>
                   </pic:nvPicPr>
                   <pic:blipFill>
@@ -11982,7 +12160,7 @@
                   <pic:spPr>
                     <a:xfrm>
                       <a:off x="0" y="0"/>
-                      <a:ext cx="3368040" cy="536575"/>
+                      <a:ext cx="3387695" cy="584925"/>
                     </a:xfrm>
                     <a:prstGeom prst="rect">
                       <a:avLst/>
@@ -12005,7 +12183,7 @@
           <w:noProof/>
         </w:rPr>
         <w:drawing>
-          <wp:anchor distT="0" distB="0" distL="114300" distR="114300" simplePos="0" relativeHeight="251702323" behindDoc="0" locked="0" layoutInCell="1" allowOverlap="1" wp14:anchorId="641AF614" wp14:editId="1CAF2EED">
+          <wp:anchor distT="0" distB="0" distL="114300" distR="114300" simplePos="0" relativeHeight="251702323" behindDoc="0" locked="0" layoutInCell="1" allowOverlap="1" wp14:anchorId="641AF614" wp14:editId="18A40688">
             <wp:simplePos x="0" y="0"/>
             <wp:positionH relativeFrom="column">
               <wp:posOffset>1944030</wp:posOffset>
@@ -12074,25 +12252,28 @@
         <w:t xml:space="preserve">Sprint 2: </w:t>
       </w:r>
       <w:r>
-        <w:t>Wire the frontend to the backend to get real data</w:t>
+        <w:t>End-to-end Places page connectivity</w:t>
       </w:r>
     </w:p>
     <w:p/>
     <w:p>
       <w:r>
+        <w:rPr>
+          <w:noProof/>
+        </w:rPr>
         <w:drawing>
-          <wp:anchor distT="0" distB="0" distL="114300" distR="114300" simplePos="0" relativeHeight="251708467" behindDoc="0" locked="0" layoutInCell="1" allowOverlap="1" wp14:anchorId="6AF26E7C" wp14:editId="75EE7162">
+          <wp:anchor distT="0" distB="0" distL="114300" distR="114300" simplePos="0" relativeHeight="251703347" behindDoc="0" locked="0" layoutInCell="1" allowOverlap="1" wp14:anchorId="26F1AC04" wp14:editId="4E99ECD1">
             <wp:simplePos x="0" y="0"/>
             <wp:positionH relativeFrom="column">
-              <wp:posOffset>6515100</wp:posOffset>
+              <wp:posOffset>4343400</wp:posOffset>
             </wp:positionH>
             <wp:positionV relativeFrom="paragraph">
-              <wp:posOffset>301581</wp:posOffset>
+              <wp:posOffset>205735</wp:posOffset>
             </wp:positionV>
-            <wp:extent cx="2976565" cy="726483"/>
-            <wp:effectExtent l="0" t="0" r="0" b="0"/>
+            <wp:extent cx="1943542" cy="821876"/>
+            <wp:effectExtent l="0" t="0" r="0" b="3810"/>
             <wp:wrapNone/>
-            <wp:docPr id="561626620" name="Picture 1" descr="A screenshot of a phone&#10;&#10;AI-generated content may be incorrect."/>
+            <wp:docPr id="1720444718" name="Picture 56" descr="A screenshot of a computer&#10;&#10;AI-generated content may be incorrect."/>
             <wp:cNvGraphicFramePr>
               <a:graphicFrameLocks xmlns:a="http://schemas.openxmlformats.org/drawingml/2006/main" noChangeAspect="1"/>
             </wp:cNvGraphicFramePr>
@@ -12100,10 +12281,10 @@
               <a:graphicData uri="http://schemas.openxmlformats.org/drawingml/2006/picture">
                 <pic:pic xmlns:pic="http://schemas.openxmlformats.org/drawingml/2006/picture">
                   <pic:nvPicPr>
-                    <pic:cNvPr id="561626620" name="Picture 1" descr="A screenshot of a phone&#10;&#10;AI-generated content may be incorrect."/>
+                    <pic:cNvPr id="1720444718" name="Picture 56" descr="A screenshot of a computer&#10;&#10;AI-generated content may be incorrect."/>
                     <pic:cNvPicPr/>
                   </pic:nvPicPr>
-                  <pic:blipFill>
+                  <pic:blipFill rotWithShape="1">
                     <a:blip r:embed="rId41" cstate="print">
                       <a:extLst>
                         <a:ext uri="{28A0092B-C50C-407E-A947-70E740481C1C}">
@@ -12111,18 +12292,27 @@
                         </a:ext>
                       </a:extLst>
                     </a:blip>
+                    <a:srcRect r="25044" b="45662"/>
                     <a:stretch>
                       <a:fillRect/>
                     </a:stretch>
                   </pic:blipFill>
-                  <pic:spPr>
+                  <pic:spPr bwMode="auto">
                     <a:xfrm>
                       <a:off x="0" y="0"/>
-                      <a:ext cx="3018136" cy="736629"/>
+                      <a:ext cx="1948079" cy="823795"/>
                     </a:xfrm>
                     <a:prstGeom prst="rect">
                       <a:avLst/>
                     </a:prstGeom>
+                    <a:ln>
+                      <a:noFill/>
+                    </a:ln>
+                    <a:extLst>
+                      <a:ext uri="{53640926-AAD7-44D8-BBD7-CCE9431645EC}">
+                        <a14:shadowObscured xmlns:a14="http://schemas.microsoft.com/office/drawing/2010/main"/>
+                      </a:ext>
+                    </a:extLst>
                   </pic:spPr>
                 </pic:pic>
               </a:graphicData>
@@ -12143,18 +12333,18 @@
         <mc:AlternateContent>
           <mc:Choice Requires="wps">
             <w:drawing>
-              <wp:anchor distT="0" distB="0" distL="114300" distR="114300" simplePos="0" relativeHeight="251705395" behindDoc="0" locked="0" layoutInCell="1" allowOverlap="1" wp14:anchorId="5AB4871D" wp14:editId="6BE2AEE6">
+              <wp:anchor distT="0" distB="0" distL="114300" distR="114300" simplePos="0" relativeHeight="251707443" behindDoc="0" locked="0" layoutInCell="1" allowOverlap="1" wp14:anchorId="141FF3B4" wp14:editId="471A87A0">
                 <wp:simplePos x="0" y="0"/>
                 <wp:positionH relativeFrom="column">
-                  <wp:posOffset>3946911</wp:posOffset>
+                  <wp:posOffset>5766392</wp:posOffset>
                 </wp:positionH>
                 <wp:positionV relativeFrom="paragraph">
-                  <wp:posOffset>3655</wp:posOffset>
+                  <wp:posOffset>207066</wp:posOffset>
                 </wp:positionV>
-                <wp:extent cx="2710366" cy="189230"/>
-                <wp:effectExtent l="25400" t="12700" r="20320" b="77470"/>
+                <wp:extent cx="710386" cy="650886"/>
+                <wp:effectExtent l="25400" t="12700" r="26670" b="34925"/>
                 <wp:wrapNone/>
-                <wp:docPr id="1592474305" name="Straight Arrow Connector 37"/>
+                <wp:docPr id="1226127957" name="Straight Arrow Connector 37"/>
                 <wp:cNvGraphicFramePr/>
                 <a:graphic xmlns:a="http://schemas.openxmlformats.org/drawingml/2006/main">
                   <a:graphicData uri="http://schemas.microsoft.com/office/word/2010/wordprocessingShape">
@@ -12163,7 +12353,7 @@
                       <wps:spPr>
                         <a:xfrm flipH="1">
                           <a:off x="0" y="0"/>
-                          <a:ext cx="2710366" cy="189230"/>
+                          <a:ext cx="710386" cy="650886"/>
                         </a:xfrm>
                         <a:prstGeom prst="straightConnector1">
                           <a:avLst/>
@@ -12204,7 +12394,11 @@
           </mc:Choice>
           <mc:Fallback>
             <w:pict>
-              <v:shape w14:anchorId="415040F4" id="Straight Arrow Connector 37" o:spid="_x0000_s1026" type="#_x0000_t32" style="position:absolute;margin-left:310.8pt;margin-top:.3pt;width:213.4pt;height:14.9pt;flip:x;z-index:251705395;visibility:visible;mso-wrap-style:square;mso-width-percent:0;mso-height-percent:0;mso-wrap-distance-left:9pt;mso-wrap-distance-top:0;mso-wrap-distance-right:9pt;mso-wrap-distance-bottom:0;mso-position-horizontal:absolute;mso-position-horizontal-relative:text;mso-position-vertical:absolute;mso-position-vertical-relative:text;mso-width-percent:0;mso-height-percent:0;mso-width-relative:margin;mso-height-relative:margin" o:gfxdata="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" strokecolor="#e00" strokeweight="3pt">
+              <v:shapetype w14:anchorId="2B06E3CA" id="_x0000_t32" coordsize="21600,21600" o:spt="32" o:oned="t" path="m,l21600,21600e" filled="f">
+                <v:path arrowok="t" fillok="f" o:connecttype="none"/>
+                <o:lock v:ext="edit" shapetype="t"/>
+              </v:shapetype>
+              <v:shape id="Straight Arrow Connector 37" o:spid="_x0000_s1026" type="#_x0000_t32" style="position:absolute;margin-left:454.05pt;margin-top:16.3pt;width:55.95pt;height:51.25pt;flip:x;z-index:251707443;visibility:visible;mso-wrap-style:square;mso-width-percent:0;mso-height-percent:0;mso-wrap-distance-left:9pt;mso-wrap-distance-top:0;mso-wrap-distance-right:9pt;mso-wrap-distance-bottom:0;mso-position-horizontal:absolute;mso-position-horizontal-relative:text;mso-position-vertical:absolute;mso-position-vertical-relative:text;mso-width-percent:0;mso-height-percent:0;mso-width-relative:margin;mso-height-relative:margin" o:gfxdata="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" strokecolor="#e00" strokeweight="3pt">
                 <v:stroke endarrow="block" joinstyle="miter"/>
               </v:shape>
             </w:pict>
@@ -12218,18 +12412,18 @@
         <mc:AlternateContent>
           <mc:Choice Requires="wps">
             <w:drawing>
-              <wp:anchor distT="0" distB="0" distL="114300" distR="114300" simplePos="0" relativeHeight="251707443" behindDoc="0" locked="0" layoutInCell="1" allowOverlap="1" wp14:anchorId="141FF3B4" wp14:editId="1EC6B20A">
+              <wp:anchor distT="0" distB="0" distL="114300" distR="114300" simplePos="0" relativeHeight="251705395" behindDoc="0" locked="0" layoutInCell="1" allowOverlap="1" wp14:anchorId="5AB4871D" wp14:editId="7AB20153">
                 <wp:simplePos x="0" y="0"/>
                 <wp:positionH relativeFrom="column">
-                  <wp:posOffset>5768277</wp:posOffset>
+                  <wp:posOffset>3945589</wp:posOffset>
                 </wp:positionH>
                 <wp:positionV relativeFrom="paragraph">
-                  <wp:posOffset>192994</wp:posOffset>
+                  <wp:posOffset>36449</wp:posOffset>
                 </wp:positionV>
-                <wp:extent cx="710581" cy="665387"/>
-                <wp:effectExtent l="25400" t="12700" r="26035" b="33655"/>
+                <wp:extent cx="2499197" cy="157628"/>
+                <wp:effectExtent l="25400" t="12700" r="15875" b="83820"/>
                 <wp:wrapNone/>
-                <wp:docPr id="1226127957" name="Straight Arrow Connector 37"/>
+                <wp:docPr id="1592474305" name="Straight Arrow Connector 37"/>
                 <wp:cNvGraphicFramePr/>
                 <a:graphic xmlns:a="http://schemas.openxmlformats.org/drawingml/2006/main">
                   <a:graphicData uri="http://schemas.microsoft.com/office/word/2010/wordprocessingShape">
@@ -12238,7 +12432,7 @@
                       <wps:spPr>
                         <a:xfrm flipH="1">
                           <a:off x="0" y="0"/>
-                          <a:ext cx="710581" cy="665387"/>
+                          <a:ext cx="2499197" cy="157628"/>
                         </a:xfrm>
                         <a:prstGeom prst="straightConnector1">
                           <a:avLst/>
@@ -12279,7 +12473,7 @@
           </mc:Choice>
           <mc:Fallback>
             <w:pict>
-              <v:shape w14:anchorId="38DB28C5" id="Straight Arrow Connector 37" o:spid="_x0000_s1026" type="#_x0000_t32" style="position:absolute;margin-left:454.2pt;margin-top:15.2pt;width:55.95pt;height:52.4pt;flip:x;z-index:251707443;visibility:visible;mso-wrap-style:square;mso-width-percent:0;mso-height-percent:0;mso-wrap-distance-left:9pt;mso-wrap-distance-top:0;mso-wrap-distance-right:9pt;mso-wrap-distance-bottom:0;mso-position-horizontal:absolute;mso-position-horizontal-relative:text;mso-position-vertical:absolute;mso-position-vertical-relative:text;mso-width-percent:0;mso-height-percent:0;mso-width-relative:margin;mso-height-relative:margin" o:gfxdata="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" strokecolor="#e00" strokeweight="3pt">
+              <v:shape w14:anchorId="1BFF3EF2" id="Straight Arrow Connector 37" o:spid="_x0000_s1026" type="#_x0000_t32" style="position:absolute;margin-left:310.7pt;margin-top:2.85pt;width:196.8pt;height:12.4pt;flip:x;z-index:251705395;visibility:visible;mso-wrap-style:square;mso-width-percent:0;mso-height-percent:0;mso-wrap-distance-left:9pt;mso-wrap-distance-top:0;mso-wrap-distance-right:9pt;mso-wrap-distance-bottom:0;mso-position-horizontal:absolute;mso-position-horizontal-relative:text;mso-position-vertical:absolute;mso-position-vertical-relative:text;mso-width-percent:0;mso-height-percent:0;mso-width-relative:margin;mso-height-relative:margin" o:gfxdata="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" strokecolor="#e00" strokeweight="3pt">
                 <v:stroke endarrow="block" joinstyle="miter"/>
               </v:shape>
             </w:pict>
@@ -12291,18 +12485,18 @@
           <w:noProof/>
         </w:rPr>
         <w:drawing>
-          <wp:anchor distT="0" distB="0" distL="114300" distR="114300" simplePos="0" relativeHeight="251703347" behindDoc="0" locked="0" layoutInCell="1" allowOverlap="1" wp14:anchorId="26F1AC04" wp14:editId="498B33D8">
+          <wp:anchor distT="0" distB="0" distL="114300" distR="114300" simplePos="0" relativeHeight="251708467" behindDoc="0" locked="0" layoutInCell="1" allowOverlap="1" wp14:anchorId="6AF26E7C" wp14:editId="2E97C022">
             <wp:simplePos x="0" y="0"/>
             <wp:positionH relativeFrom="column">
-              <wp:posOffset>4457700</wp:posOffset>
+              <wp:posOffset>6515100</wp:posOffset>
             </wp:positionH>
             <wp:positionV relativeFrom="paragraph">
-              <wp:posOffset>258306</wp:posOffset>
+              <wp:posOffset>301581</wp:posOffset>
             </wp:positionV>
-            <wp:extent cx="1826926" cy="772562"/>
-            <wp:effectExtent l="0" t="0" r="1905" b="2540"/>
+            <wp:extent cx="2976565" cy="726483"/>
+            <wp:effectExtent l="0" t="0" r="0" b="0"/>
             <wp:wrapNone/>
-            <wp:docPr id="1720444718" name="Picture 56" descr="A screenshot of a computer&#10;&#10;AI-generated content may be incorrect."/>
+            <wp:docPr id="561626620" name="Picture 1" descr="A screenshot of a phone&#10;&#10;AI-generated content may be incorrect."/>
             <wp:cNvGraphicFramePr>
               <a:graphicFrameLocks xmlns:a="http://schemas.openxmlformats.org/drawingml/2006/main" noChangeAspect="1"/>
             </wp:cNvGraphicFramePr>
@@ -12310,10 +12504,10 @@
               <a:graphicData uri="http://schemas.openxmlformats.org/drawingml/2006/picture">
                 <pic:pic xmlns:pic="http://schemas.openxmlformats.org/drawingml/2006/picture">
                   <pic:nvPicPr>
-                    <pic:cNvPr id="1720444718" name="Picture 56" descr="A screenshot of a computer&#10;&#10;AI-generated content may be incorrect."/>
+                    <pic:cNvPr id="561626620" name="Picture 1" descr="A screenshot of a phone&#10;&#10;AI-generated content may be incorrect."/>
                     <pic:cNvPicPr/>
                   </pic:nvPicPr>
-                  <pic:blipFill rotWithShape="1">
+                  <pic:blipFill>
                     <a:blip r:embed="rId42" cstate="print">
                       <a:extLst>
                         <a:ext uri="{28A0092B-C50C-407E-A947-70E740481C1C}">
@@ -12321,27 +12515,18 @@
                         </a:ext>
                       </a:extLst>
                     </a:blip>
-                    <a:srcRect r="25044" b="45662"/>
                     <a:stretch>
                       <a:fillRect/>
                     </a:stretch>
                   </pic:blipFill>
-                  <pic:spPr bwMode="auto">
+                  <pic:spPr>
                     <a:xfrm>
                       <a:off x="0" y="0"/>
-                      <a:ext cx="1922406" cy="812938"/>
+                      <a:ext cx="3018136" cy="736629"/>
                     </a:xfrm>
                     <a:prstGeom prst="rect">
                       <a:avLst/>
                     </a:prstGeom>
-                    <a:ln>
-                      <a:noFill/>
-                    </a:ln>
-                    <a:extLst>
-                      <a:ext uri="{53640926-AAD7-44D8-BBD7-CCE9431645EC}">
-                        <a14:shadowObscured xmlns:a14="http://schemas.microsoft.com/office/drawing/2010/main"/>
-                      </a:ext>
-                    </a:extLst>
                   </pic:spPr>
                 </pic:pic>
               </a:graphicData>

</xml_diff>